<commit_message>
Se adiciona evidencia de sprint planning
</commit_message>
<xml_diff>
--- a/Documentacion/MindBalance_Formulacion.docx
+++ b/Documentacion/MindBalance_Formulacion.docx
@@ -331,7 +331,7 @@
             </w:rPr>
             <w:fldChar w:fldCharType="separate"/>
           </w:r>
-          <w:hyperlink w:anchor="_Toc226233140" w:history="1">
+          <w:hyperlink w:anchor="_Toc226299455" w:history="1">
             <w:r>
               <w:rPr>
                 <w:rStyle w:val="Hipervnculo"/>
@@ -359,7 +359,7 @@
                 <w:noProof/>
                 <w:webHidden/>
               </w:rPr>
-              <w:instrText xml:space="preserve"> PAGEREF _Toc226233140 \h </w:instrText>
+              <w:instrText xml:space="preserve"> PAGEREF _Toc226299455 \h </w:instrText>
             </w:r>
             <w:r>
               <w:rPr>
@@ -405,7 +405,7 @@
               <w14:ligatures w14:val="standardContextual"/>
             </w:rPr>
           </w:pPr>
-          <w:hyperlink w:anchor="_Toc226233141" w:history="1">
+          <w:hyperlink w:anchor="_Toc226299456" w:history="1">
             <w:r>
               <w:rPr>
                 <w:rStyle w:val="Hipervnculo"/>
@@ -433,7 +433,7 @@
                 <w:noProof/>
                 <w:webHidden/>
               </w:rPr>
-              <w:instrText xml:space="preserve"> PAGEREF _Toc226233141 \h </w:instrText>
+              <w:instrText xml:space="preserve"> PAGEREF _Toc226299456 \h </w:instrText>
             </w:r>
             <w:r>
               <w:rPr>
@@ -479,7 +479,7 @@
               <w14:ligatures w14:val="standardContextual"/>
             </w:rPr>
           </w:pPr>
-          <w:hyperlink w:anchor="_Toc226233142" w:history="1">
+          <w:hyperlink w:anchor="_Toc226299457" w:history="1">
             <w:r>
               <w:rPr>
                 <w:rStyle w:val="Hipervnculo"/>
@@ -507,7 +507,7 @@
                 <w:noProof/>
                 <w:webHidden/>
               </w:rPr>
-              <w:instrText xml:space="preserve"> PAGEREF _Toc226233142 \h </w:instrText>
+              <w:instrText xml:space="preserve"> PAGEREF _Toc226299457 \h </w:instrText>
             </w:r>
             <w:r>
               <w:rPr>
@@ -553,7 +553,7 @@
               <w14:ligatures w14:val="standardContextual"/>
             </w:rPr>
           </w:pPr>
-          <w:hyperlink w:anchor="_Toc226233143" w:history="1">
+          <w:hyperlink w:anchor="_Toc226299458" w:history="1">
             <w:r>
               <w:rPr>
                 <w:rStyle w:val="Hipervnculo"/>
@@ -581,7 +581,7 @@
                 <w:noProof/>
                 <w:webHidden/>
               </w:rPr>
-              <w:instrText xml:space="preserve"> PAGEREF _Toc226233143 \h </w:instrText>
+              <w:instrText xml:space="preserve"> PAGEREF _Toc226299458 \h </w:instrText>
             </w:r>
             <w:r>
               <w:rPr>
@@ -627,7 +627,7 @@
               <w14:ligatures w14:val="standardContextual"/>
             </w:rPr>
           </w:pPr>
-          <w:hyperlink w:anchor="_Toc226233144" w:history="1">
+          <w:hyperlink w:anchor="_Toc226299459" w:history="1">
             <w:r>
               <w:rPr>
                 <w:rStyle w:val="Hipervnculo"/>
@@ -655,7 +655,7 @@
                 <w:noProof/>
                 <w:webHidden/>
               </w:rPr>
-              <w:instrText xml:space="preserve"> PAGEREF _Toc226233144 \h </w:instrText>
+              <w:instrText xml:space="preserve"> PAGEREF _Toc226299459 \h </w:instrText>
             </w:r>
             <w:r>
               <w:rPr>
@@ -675,7 +675,7 @@
                 <w:noProof/>
                 <w:webHidden/>
               </w:rPr>
-              <w:t>3</w:t>
+              <w:t>4</w:t>
             </w:r>
             <w:r>
               <w:rPr>
@@ -701,7 +701,7 @@
               <w14:ligatures w14:val="standardContextual"/>
             </w:rPr>
           </w:pPr>
-          <w:hyperlink w:anchor="_Toc226233145" w:history="1">
+          <w:hyperlink w:anchor="_Toc226299460" w:history="1">
             <w:r>
               <w:rPr>
                 <w:rStyle w:val="Hipervnculo"/>
@@ -729,7 +729,7 @@
                 <w:noProof/>
                 <w:webHidden/>
               </w:rPr>
-              <w:instrText xml:space="preserve"> PAGEREF _Toc226233145 \h </w:instrText>
+              <w:instrText xml:space="preserve"> PAGEREF _Toc226299460 \h </w:instrText>
             </w:r>
             <w:r>
               <w:rPr>
@@ -749,7 +749,7 @@
                 <w:noProof/>
                 <w:webHidden/>
               </w:rPr>
-              <w:t>3</w:t>
+              <w:t>4</w:t>
             </w:r>
             <w:r>
               <w:rPr>
@@ -775,7 +775,7 @@
               <w14:ligatures w14:val="standardContextual"/>
             </w:rPr>
           </w:pPr>
-          <w:hyperlink w:anchor="_Toc226233146" w:history="1">
+          <w:hyperlink w:anchor="_Toc226299461" w:history="1">
             <w:r>
               <w:rPr>
                 <w:rStyle w:val="Hipervnculo"/>
@@ -803,7 +803,7 @@
                 <w:noProof/>
                 <w:webHidden/>
               </w:rPr>
-              <w:instrText xml:space="preserve"> PAGEREF _Toc226233146 \h </w:instrText>
+              <w:instrText xml:space="preserve"> PAGEREF _Toc226299461 \h </w:instrText>
             </w:r>
             <w:r>
               <w:rPr>
@@ -849,7 +849,7 @@
               <w14:ligatures w14:val="standardContextual"/>
             </w:rPr>
           </w:pPr>
-          <w:hyperlink w:anchor="_Toc226233147" w:history="1">
+          <w:hyperlink w:anchor="_Toc226299462" w:history="1">
             <w:r>
               <w:rPr>
                 <w:rStyle w:val="Hipervnculo"/>
@@ -877,7 +877,7 @@
                 <w:noProof/>
                 <w:webHidden/>
               </w:rPr>
-              <w:instrText xml:space="preserve"> PAGEREF _Toc226233147 \h </w:instrText>
+              <w:instrText xml:space="preserve"> PAGEREF _Toc226299462 \h </w:instrText>
             </w:r>
             <w:r>
               <w:rPr>
@@ -923,7 +923,7 @@
               <w14:ligatures w14:val="standardContextual"/>
             </w:rPr>
           </w:pPr>
-          <w:hyperlink w:anchor="_Toc226233148" w:history="1">
+          <w:hyperlink w:anchor="_Toc226299463" w:history="1">
             <w:r>
               <w:rPr>
                 <w:rStyle w:val="Hipervnculo"/>
@@ -951,7 +951,7 @@
                 <w:noProof/>
                 <w:webHidden/>
               </w:rPr>
-              <w:instrText xml:space="preserve"> PAGEREF _Toc226233148 \h </w:instrText>
+              <w:instrText xml:space="preserve"> PAGEREF _Toc226299463 \h </w:instrText>
             </w:r>
             <w:r>
               <w:rPr>
@@ -997,7 +997,7 @@
               <w14:ligatures w14:val="standardContextual"/>
             </w:rPr>
           </w:pPr>
-          <w:hyperlink w:anchor="_Toc226233149" w:history="1">
+          <w:hyperlink w:anchor="_Toc226299464" w:history="1">
             <w:r>
               <w:rPr>
                 <w:rStyle w:val="Hipervnculo"/>
@@ -1025,7 +1025,7 @@
                 <w:noProof/>
                 <w:webHidden/>
               </w:rPr>
-              <w:instrText xml:space="preserve"> PAGEREF _Toc226233149 \h </w:instrText>
+              <w:instrText xml:space="preserve"> PAGEREF _Toc226299464 \h </w:instrText>
             </w:r>
             <w:r>
               <w:rPr>
@@ -1071,7 +1071,7 @@
               <w14:ligatures w14:val="standardContextual"/>
             </w:rPr>
           </w:pPr>
-          <w:hyperlink w:anchor="_Toc226233150" w:history="1">
+          <w:hyperlink w:anchor="_Toc226299465" w:history="1">
             <w:r>
               <w:rPr>
                 <w:rStyle w:val="Hipervnculo"/>
@@ -1099,7 +1099,7 @@
                 <w:noProof/>
                 <w:webHidden/>
               </w:rPr>
-              <w:instrText xml:space="preserve"> PAGEREF _Toc226233150 \h </w:instrText>
+              <w:instrText xml:space="preserve"> PAGEREF _Toc226299465 \h </w:instrText>
             </w:r>
             <w:r>
               <w:rPr>
@@ -1145,7 +1145,7 @@
               <w14:ligatures w14:val="standardContextual"/>
             </w:rPr>
           </w:pPr>
-          <w:hyperlink w:anchor="_Toc226233151" w:history="1">
+          <w:hyperlink w:anchor="_Toc226299466" w:history="1">
             <w:r>
               <w:rPr>
                 <w:rStyle w:val="Hipervnculo"/>
@@ -1173,7 +1173,7 @@
                 <w:noProof/>
                 <w:webHidden/>
               </w:rPr>
-              <w:instrText xml:space="preserve"> PAGEREF _Toc226233151 \h </w:instrText>
+              <w:instrText xml:space="preserve"> PAGEREF _Toc226299466 \h </w:instrText>
             </w:r>
             <w:r>
               <w:rPr>
@@ -1193,7 +1193,7 @@
                 <w:noProof/>
                 <w:webHidden/>
               </w:rPr>
-              <w:t>4</w:t>
+              <w:t>5</w:t>
             </w:r>
             <w:r>
               <w:rPr>
@@ -1219,7 +1219,7 @@
               <w14:ligatures w14:val="standardContextual"/>
             </w:rPr>
           </w:pPr>
-          <w:hyperlink w:anchor="_Toc226233152" w:history="1">
+          <w:hyperlink w:anchor="_Toc226299467" w:history="1">
             <w:r>
               <w:rPr>
                 <w:rStyle w:val="Hipervnculo"/>
@@ -1247,7 +1247,7 @@
                 <w:noProof/>
                 <w:webHidden/>
               </w:rPr>
-              <w:instrText xml:space="preserve"> PAGEREF _Toc226233152 \h </w:instrText>
+              <w:instrText xml:space="preserve"> PAGEREF _Toc226299467 \h </w:instrText>
             </w:r>
             <w:r>
               <w:rPr>
@@ -1293,7 +1293,7 @@
               <w14:ligatures w14:val="standardContextual"/>
             </w:rPr>
           </w:pPr>
-          <w:hyperlink w:anchor="_Toc226233153" w:history="1">
+          <w:hyperlink w:anchor="_Toc226299468" w:history="1">
             <w:r>
               <w:rPr>
                 <w:rStyle w:val="Hipervnculo"/>
@@ -1321,7 +1321,7 @@
                 <w:noProof/>
                 <w:webHidden/>
               </w:rPr>
-              <w:instrText xml:space="preserve"> PAGEREF _Toc226233153 \h </w:instrText>
+              <w:instrText xml:space="preserve"> PAGEREF _Toc226299468 \h </w:instrText>
             </w:r>
             <w:r>
               <w:rPr>
@@ -1367,7 +1367,7 @@
               <w14:ligatures w14:val="standardContextual"/>
             </w:rPr>
           </w:pPr>
-          <w:hyperlink w:anchor="_Toc226233154" w:history="1">
+          <w:hyperlink w:anchor="_Toc226299469" w:history="1">
             <w:r>
               <w:rPr>
                 <w:rStyle w:val="Hipervnculo"/>
@@ -1395,7 +1395,7 @@
                 <w:noProof/>
                 <w:webHidden/>
               </w:rPr>
-              <w:instrText xml:space="preserve"> PAGEREF _Toc226233154 \h </w:instrText>
+              <w:instrText xml:space="preserve"> PAGEREF _Toc226299469 \h </w:instrText>
             </w:r>
             <w:r>
               <w:rPr>
@@ -1441,7 +1441,7 @@
               <w14:ligatures w14:val="standardContextual"/>
             </w:rPr>
           </w:pPr>
-          <w:hyperlink w:anchor="_Toc226233155" w:history="1">
+          <w:hyperlink w:anchor="_Toc226299470" w:history="1">
             <w:r>
               <w:rPr>
                 <w:rStyle w:val="Hipervnculo"/>
@@ -1469,7 +1469,7 @@
                 <w:noProof/>
                 <w:webHidden/>
               </w:rPr>
-              <w:instrText xml:space="preserve"> PAGEREF _Toc226233155 \h </w:instrText>
+              <w:instrText xml:space="preserve"> PAGEREF _Toc226299470 \h </w:instrText>
             </w:r>
             <w:r>
               <w:rPr>
@@ -1515,7 +1515,7 @@
               <w14:ligatures w14:val="standardContextual"/>
             </w:rPr>
           </w:pPr>
-          <w:hyperlink w:anchor="_Toc226233156" w:history="1">
+          <w:hyperlink w:anchor="_Toc226299471" w:history="1">
             <w:r>
               <w:rPr>
                 <w:rStyle w:val="Hipervnculo"/>
@@ -1543,7 +1543,7 @@
                 <w:noProof/>
                 <w:webHidden/>
               </w:rPr>
-              <w:instrText xml:space="preserve"> PAGEREF _Toc226233156 \h </w:instrText>
+              <w:instrText xml:space="preserve"> PAGEREF _Toc226299471 \h </w:instrText>
             </w:r>
             <w:r>
               <w:rPr>
@@ -1589,7 +1589,7 @@
               <w14:ligatures w14:val="standardContextual"/>
             </w:rPr>
           </w:pPr>
-          <w:hyperlink w:anchor="_Toc226233157" w:history="1">
+          <w:hyperlink w:anchor="_Toc226299472" w:history="1">
             <w:r>
               <w:rPr>
                 <w:rStyle w:val="Hipervnculo"/>
@@ -1617,7 +1617,7 @@
                 <w:noProof/>
                 <w:webHidden/>
               </w:rPr>
-              <w:instrText xml:space="preserve"> PAGEREF _Toc226233157 \h </w:instrText>
+              <w:instrText xml:space="preserve"> PAGEREF _Toc226299472 \h </w:instrText>
             </w:r>
             <w:r>
               <w:rPr>
@@ -1663,13 +1663,87 @@
               <w14:ligatures w14:val="standardContextual"/>
             </w:rPr>
           </w:pPr>
-          <w:hyperlink w:anchor="_Toc226233158" w:history="1">
+          <w:hyperlink w:anchor="_Toc226299473" w:history="1">
             <w:r>
               <w:rPr>
                 <w:rStyle w:val="Hipervnculo"/>
                 <w:rFonts w:ascii="Times New Roman" w:hAnsi="Times New Roman" w:cs="Times New Roman"/>
                 <w:noProof/>
               </w:rPr>
+              <w:t>4.3.1 planeación del sprint 1</w:t>
+            </w:r>
+            <w:r>
+              <w:rPr>
+                <w:noProof/>
+                <w:webHidden/>
+              </w:rPr>
+              <w:tab/>
+            </w:r>
+            <w:r>
+              <w:rPr>
+                <w:noProof/>
+                <w:webHidden/>
+              </w:rPr>
+              <w:fldChar w:fldCharType="begin"/>
+            </w:r>
+            <w:r>
+              <w:rPr>
+                <w:noProof/>
+                <w:webHidden/>
+              </w:rPr>
+              <w:instrText xml:space="preserve"> PAGEREF _Toc226299473 \h </w:instrText>
+            </w:r>
+            <w:r>
+              <w:rPr>
+                <w:noProof/>
+                <w:webHidden/>
+              </w:rPr>
+            </w:r>
+            <w:r>
+              <w:rPr>
+                <w:noProof/>
+                <w:webHidden/>
+              </w:rPr>
+              <w:fldChar w:fldCharType="separate"/>
+            </w:r>
+            <w:r>
+              <w:rPr>
+                <w:noProof/>
+                <w:webHidden/>
+              </w:rPr>
+              <w:t>6</w:t>
+            </w:r>
+            <w:r>
+              <w:rPr>
+                <w:noProof/>
+                <w:webHidden/>
+              </w:rPr>
+              <w:fldChar w:fldCharType="end"/>
+            </w:r>
+          </w:hyperlink>
+        </w:p>
+        <w:p>
+          <w:pPr>
+            <w:pStyle w:val="TDC2"/>
+            <w:tabs>
+              <w:tab w:val="right" w:leader="dot" w:pos="9016"/>
+            </w:tabs>
+            <w:rPr>
+              <w:rFonts w:asciiTheme="minorHAnsi" w:eastAsiaTheme="minorEastAsia" w:hAnsiTheme="minorHAnsi" w:cstheme="minorBidi"/>
+              <w:noProof/>
+              <w:kern w:val="2"/>
+              <w:sz w:val="24"/>
+              <w:szCs w:val="24"/>
+              <w14:ligatures w14:val="standardContextual"/>
+            </w:rPr>
+          </w:pPr>
+          <w:hyperlink w:anchor="_Toc226299474" w:history="1">
+            <w:r>
+              <w:rPr>
+                <w:rStyle w:val="Hipervnculo"/>
+                <w:rFonts w:ascii="Times New Roman" w:hAnsi="Times New Roman" w:cs="Times New Roman"/>
+                <w:noProof/>
+              </w:rPr>
               <w:t>4.4 Herramientas de Gestión</w:t>
             </w:r>
             <w:r>
@@ -1691,7 +1765,7 @@
                 <w:noProof/>
                 <w:webHidden/>
               </w:rPr>
-              <w:instrText xml:space="preserve"> PAGEREF _Toc226233158 \h </w:instrText>
+              <w:instrText xml:space="preserve"> PAGEREF _Toc226299474 \h </w:instrText>
             </w:r>
             <w:r>
               <w:rPr>
@@ -1711,7 +1785,7 @@
                 <w:noProof/>
                 <w:webHidden/>
               </w:rPr>
-              <w:t>5</w:t>
+              <w:t>6</w:t>
             </w:r>
             <w:r>
               <w:rPr>
@@ -1737,7 +1811,7 @@
               <w14:ligatures w14:val="standardContextual"/>
             </w:rPr>
           </w:pPr>
-          <w:hyperlink w:anchor="_Toc226233159" w:history="1">
+          <w:hyperlink w:anchor="_Toc226299475" w:history="1">
             <w:r>
               <w:rPr>
                 <w:rStyle w:val="Hipervnculo"/>
@@ -1765,7 +1839,7 @@
                 <w:noProof/>
                 <w:webHidden/>
               </w:rPr>
-              <w:instrText xml:space="preserve"> PAGEREF _Toc226233159 \h </w:instrText>
+              <w:instrText xml:space="preserve"> PAGEREF _Toc226299475 \h </w:instrText>
             </w:r>
             <w:r>
               <w:rPr>
@@ -1785,7 +1859,7 @@
                 <w:noProof/>
                 <w:webHidden/>
               </w:rPr>
-              <w:t>6</w:t>
+              <w:t>7</w:t>
             </w:r>
             <w:r>
               <w:rPr>
@@ -1811,7 +1885,7 @@
               <w14:ligatures w14:val="standardContextual"/>
             </w:rPr>
           </w:pPr>
-          <w:hyperlink w:anchor="_Toc226233160" w:history="1">
+          <w:hyperlink w:anchor="_Toc226299476" w:history="1">
             <w:r>
               <w:rPr>
                 <w:rStyle w:val="Hipervnculo"/>
@@ -1839,7 +1913,7 @@
                 <w:noProof/>
                 <w:webHidden/>
               </w:rPr>
-              <w:instrText xml:space="preserve"> PAGEREF _Toc226233160 \h </w:instrText>
+              <w:instrText xml:space="preserve"> PAGEREF _Toc226299476 \h </w:instrText>
             </w:r>
             <w:r>
               <w:rPr>
@@ -1859,7 +1933,7 @@
                 <w:noProof/>
                 <w:webHidden/>
               </w:rPr>
-              <w:t>6</w:t>
+              <w:t>7</w:t>
             </w:r>
             <w:r>
               <w:rPr>
@@ -1885,7 +1959,7 @@
               <w14:ligatures w14:val="standardContextual"/>
             </w:rPr>
           </w:pPr>
-          <w:hyperlink w:anchor="_Toc226233161" w:history="1">
+          <w:hyperlink w:anchor="_Toc226299477" w:history="1">
             <w:r>
               <w:rPr>
                 <w:rStyle w:val="Hipervnculo"/>
@@ -1913,7 +1987,7 @@
                 <w:noProof/>
                 <w:webHidden/>
               </w:rPr>
-              <w:instrText xml:space="preserve"> PAGEREF _Toc226233161 \h </w:instrText>
+              <w:instrText xml:space="preserve"> PAGEREF _Toc226299477 \h </w:instrText>
             </w:r>
             <w:r>
               <w:rPr>
@@ -1933,7 +2007,7 @@
                 <w:noProof/>
                 <w:webHidden/>
               </w:rPr>
-              <w:t>7</w:t>
+              <w:t>8</w:t>
             </w:r>
             <w:r>
               <w:rPr>
@@ -1959,7 +2033,7 @@
               <w14:ligatures w14:val="standardContextual"/>
             </w:rPr>
           </w:pPr>
-          <w:hyperlink w:anchor="_Toc226233162" w:history="1">
+          <w:hyperlink w:anchor="_Toc226299478" w:history="1">
             <w:r>
               <w:rPr>
                 <w:rStyle w:val="Hipervnculo"/>
@@ -1987,7 +2061,7 @@
                 <w:noProof/>
                 <w:webHidden/>
               </w:rPr>
-              <w:instrText xml:space="preserve"> PAGEREF _Toc226233162 \h </w:instrText>
+              <w:instrText xml:space="preserve"> PAGEREF _Toc226299478 \h </w:instrText>
             </w:r>
             <w:r>
               <w:rPr>
@@ -2007,7 +2081,7 @@
                 <w:noProof/>
                 <w:webHidden/>
               </w:rPr>
-              <w:t>7</w:t>
+              <w:t>8</w:t>
             </w:r>
             <w:r>
               <w:rPr>
@@ -2033,7 +2107,7 @@
               <w14:ligatures w14:val="standardContextual"/>
             </w:rPr>
           </w:pPr>
-          <w:hyperlink w:anchor="_Toc226233163" w:history="1">
+          <w:hyperlink w:anchor="_Toc226299479" w:history="1">
             <w:r>
               <w:rPr>
                 <w:rStyle w:val="Hipervnculo"/>
@@ -2061,7 +2135,7 @@
                 <w:noProof/>
                 <w:webHidden/>
               </w:rPr>
-              <w:instrText xml:space="preserve"> PAGEREF _Toc226233163 \h </w:instrText>
+              <w:instrText xml:space="preserve"> PAGEREF _Toc226299479 \h </w:instrText>
             </w:r>
             <w:r>
               <w:rPr>
@@ -2081,7 +2155,7 @@
                 <w:noProof/>
                 <w:webHidden/>
               </w:rPr>
-              <w:t>7</w:t>
+              <w:t>8</w:t>
             </w:r>
             <w:r>
               <w:rPr>
@@ -2107,7 +2181,7 @@
               <w14:ligatures w14:val="standardContextual"/>
             </w:rPr>
           </w:pPr>
-          <w:hyperlink w:anchor="_Toc226233164" w:history="1">
+          <w:hyperlink w:anchor="_Toc226299480" w:history="1">
             <w:r>
               <w:rPr>
                 <w:rStyle w:val="Hipervnculo"/>
@@ -2135,7 +2209,7 @@
                 <w:noProof/>
                 <w:webHidden/>
               </w:rPr>
-              <w:instrText xml:space="preserve"> PAGEREF _Toc226233164 \h </w:instrText>
+              <w:instrText xml:space="preserve"> PAGEREF _Toc226299480 \h </w:instrText>
             </w:r>
             <w:r>
               <w:rPr>
@@ -2155,7 +2229,7 @@
                 <w:noProof/>
                 <w:webHidden/>
               </w:rPr>
-              <w:t>7</w:t>
+              <w:t>8</w:t>
             </w:r>
             <w:r>
               <w:rPr>
@@ -2181,7 +2255,7 @@
               <w14:ligatures w14:val="standardContextual"/>
             </w:rPr>
           </w:pPr>
-          <w:hyperlink w:anchor="_Toc226233165" w:history="1">
+          <w:hyperlink w:anchor="_Toc226299481" w:history="1">
             <w:r>
               <w:rPr>
                 <w:rStyle w:val="Hipervnculo"/>
@@ -2209,7 +2283,7 @@
                 <w:noProof/>
                 <w:webHidden/>
               </w:rPr>
-              <w:instrText xml:space="preserve"> PAGEREF _Toc226233165 \h </w:instrText>
+              <w:instrText xml:space="preserve"> PAGEREF _Toc226299481 \h </w:instrText>
             </w:r>
             <w:r>
               <w:rPr>
@@ -2229,7 +2303,7 @@
                 <w:noProof/>
                 <w:webHidden/>
               </w:rPr>
-              <w:t>8</w:t>
+              <w:t>9</w:t>
             </w:r>
             <w:r>
               <w:rPr>
@@ -2255,7 +2329,7 @@
               <w14:ligatures w14:val="standardContextual"/>
             </w:rPr>
           </w:pPr>
-          <w:hyperlink w:anchor="_Toc226233166" w:history="1">
+          <w:hyperlink w:anchor="_Toc226299482" w:history="1">
             <w:r>
               <w:rPr>
                 <w:rStyle w:val="Hipervnculo"/>
@@ -2283,7 +2357,7 @@
                 <w:noProof/>
                 <w:webHidden/>
               </w:rPr>
-              <w:instrText xml:space="preserve"> PAGEREF _Toc226233166 \h </w:instrText>
+              <w:instrText xml:space="preserve"> PAGEREF _Toc226299482 \h </w:instrText>
             </w:r>
             <w:r>
               <w:rPr>
@@ -2303,7 +2377,7 @@
                 <w:noProof/>
                 <w:webHidden/>
               </w:rPr>
-              <w:t>8</w:t>
+              <w:t>9</w:t>
             </w:r>
             <w:r>
               <w:rPr>
@@ -2329,7 +2403,7 @@
               <w14:ligatures w14:val="standardContextual"/>
             </w:rPr>
           </w:pPr>
-          <w:hyperlink w:anchor="_Toc226233167" w:history="1">
+          <w:hyperlink w:anchor="_Toc226299483" w:history="1">
             <w:r>
               <w:rPr>
                 <w:rStyle w:val="Hipervnculo"/>
@@ -2357,7 +2431,7 @@
                 <w:noProof/>
                 <w:webHidden/>
               </w:rPr>
-              <w:instrText xml:space="preserve"> PAGEREF _Toc226233167 \h </w:instrText>
+              <w:instrText xml:space="preserve"> PAGEREF _Toc226299483 \h </w:instrText>
             </w:r>
             <w:r>
               <w:rPr>
@@ -2377,7 +2451,7 @@
                 <w:noProof/>
                 <w:webHidden/>
               </w:rPr>
-              <w:t>9</w:t>
+              <w:t>10</w:t>
             </w:r>
             <w:r>
               <w:rPr>
@@ -2403,7 +2477,7 @@
               <w14:ligatures w14:val="standardContextual"/>
             </w:rPr>
           </w:pPr>
-          <w:hyperlink w:anchor="_Toc226233168" w:history="1">
+          <w:hyperlink w:anchor="_Toc226299484" w:history="1">
             <w:r>
               <w:rPr>
                 <w:rStyle w:val="Hipervnculo"/>
@@ -2431,7 +2505,7 @@
                 <w:noProof/>
                 <w:webHidden/>
               </w:rPr>
-              <w:instrText xml:space="preserve"> PAGEREF _Toc226233168 \h </w:instrText>
+              <w:instrText xml:space="preserve"> PAGEREF _Toc226299484 \h </w:instrText>
             </w:r>
             <w:r>
               <w:rPr>
@@ -2451,7 +2525,7 @@
                 <w:noProof/>
                 <w:webHidden/>
               </w:rPr>
-              <w:t>9</w:t>
+              <w:t>10</w:t>
             </w:r>
             <w:r>
               <w:rPr>
@@ -2477,7 +2551,7 @@
               <w14:ligatures w14:val="standardContextual"/>
             </w:rPr>
           </w:pPr>
-          <w:hyperlink w:anchor="_Toc226233169" w:history="1">
+          <w:hyperlink w:anchor="_Toc226299485" w:history="1">
             <w:r>
               <w:rPr>
                 <w:rStyle w:val="Hipervnculo"/>
@@ -2505,7 +2579,7 @@
                 <w:noProof/>
                 <w:webHidden/>
               </w:rPr>
-              <w:instrText xml:space="preserve"> PAGEREF _Toc226233169 \h </w:instrText>
+              <w:instrText xml:space="preserve"> PAGEREF _Toc226299485 \h </w:instrText>
             </w:r>
             <w:r>
               <w:rPr>
@@ -2525,7 +2599,7 @@
                 <w:noProof/>
                 <w:webHidden/>
               </w:rPr>
-              <w:t>13</w:t>
+              <w:t>14</w:t>
             </w:r>
             <w:r>
               <w:rPr>
@@ -2551,7 +2625,7 @@
               <w14:ligatures w14:val="standardContextual"/>
             </w:rPr>
           </w:pPr>
-          <w:hyperlink w:anchor="_Toc226233170" w:history="1">
+          <w:hyperlink w:anchor="_Toc226299486" w:history="1">
             <w:r>
               <w:rPr>
                 <w:rStyle w:val="Hipervnculo"/>
@@ -2579,7 +2653,7 @@
                 <w:noProof/>
                 <w:webHidden/>
               </w:rPr>
-              <w:instrText xml:space="preserve"> PAGEREF _Toc226233170 \h </w:instrText>
+              <w:instrText xml:space="preserve"> PAGEREF _Toc226299486 \h </w:instrText>
             </w:r>
             <w:r>
               <w:rPr>
@@ -2599,7 +2673,7 @@
                 <w:noProof/>
                 <w:webHidden/>
               </w:rPr>
-              <w:t>14</w:t>
+              <w:t>15</w:t>
             </w:r>
             <w:r>
               <w:rPr>
@@ -2625,7 +2699,7 @@
               <w14:ligatures w14:val="standardContextual"/>
             </w:rPr>
           </w:pPr>
-          <w:hyperlink w:anchor="_Toc226233171" w:history="1">
+          <w:hyperlink w:anchor="_Toc226299487" w:history="1">
             <w:r>
               <w:rPr>
                 <w:rStyle w:val="Hipervnculo"/>
@@ -2653,7 +2727,7 @@
                 <w:noProof/>
                 <w:webHidden/>
               </w:rPr>
-              <w:instrText xml:space="preserve"> PAGEREF _Toc226233171 \h </w:instrText>
+              <w:instrText xml:space="preserve"> PAGEREF _Toc226299487 \h </w:instrText>
             </w:r>
             <w:r>
               <w:rPr>
@@ -2673,7 +2747,7 @@
                 <w:noProof/>
                 <w:webHidden/>
               </w:rPr>
-              <w:t>14</w:t>
+              <w:t>15</w:t>
             </w:r>
             <w:r>
               <w:rPr>
@@ -2699,7 +2773,7 @@
               <w14:ligatures w14:val="standardContextual"/>
             </w:rPr>
           </w:pPr>
-          <w:hyperlink w:anchor="_Toc226233172" w:history="1">
+          <w:hyperlink w:anchor="_Toc226299488" w:history="1">
             <w:r>
               <w:rPr>
                 <w:rStyle w:val="Hipervnculo"/>
@@ -2727,7 +2801,7 @@
                 <w:noProof/>
                 <w:webHidden/>
               </w:rPr>
-              <w:instrText xml:space="preserve"> PAGEREF _Toc226233172 \h </w:instrText>
+              <w:instrText xml:space="preserve"> PAGEREF _Toc226299488 \h </w:instrText>
             </w:r>
             <w:r>
               <w:rPr>
@@ -2747,7 +2821,7 @@
                 <w:noProof/>
                 <w:webHidden/>
               </w:rPr>
-              <w:t>14</w:t>
+              <w:t>15</w:t>
             </w:r>
             <w:r>
               <w:rPr>
@@ -2773,7 +2847,7 @@
               <w14:ligatures w14:val="standardContextual"/>
             </w:rPr>
           </w:pPr>
-          <w:hyperlink w:anchor="_Toc226233173" w:history="1">
+          <w:hyperlink w:anchor="_Toc226299489" w:history="1">
             <w:r>
               <w:rPr>
                 <w:rStyle w:val="Hipervnculo"/>
@@ -2801,7 +2875,7 @@
                 <w:noProof/>
                 <w:webHidden/>
               </w:rPr>
-              <w:instrText xml:space="preserve"> PAGEREF _Toc226233173 \h </w:instrText>
+              <w:instrText xml:space="preserve"> PAGEREF _Toc226299489 \h </w:instrText>
             </w:r>
             <w:r>
               <w:rPr>
@@ -2821,7 +2895,7 @@
                 <w:noProof/>
                 <w:webHidden/>
               </w:rPr>
-              <w:t>14</w:t>
+              <w:t>15</w:t>
             </w:r>
             <w:r>
               <w:rPr>
@@ -2847,7 +2921,7 @@
               <w14:ligatures w14:val="standardContextual"/>
             </w:rPr>
           </w:pPr>
-          <w:hyperlink w:anchor="_Toc226233174" w:history="1">
+          <w:hyperlink w:anchor="_Toc226299490" w:history="1">
             <w:r>
               <w:rPr>
                 <w:rStyle w:val="Hipervnculo"/>
@@ -2875,7 +2949,7 @@
                 <w:noProof/>
                 <w:webHidden/>
               </w:rPr>
-              <w:instrText xml:space="preserve"> PAGEREF _Toc226233174 \h </w:instrText>
+              <w:instrText xml:space="preserve"> PAGEREF _Toc226299490 \h </w:instrText>
             </w:r>
             <w:r>
               <w:rPr>
@@ -2895,7 +2969,7 @@
                 <w:noProof/>
                 <w:webHidden/>
               </w:rPr>
-              <w:t>15</w:t>
+              <w:t>16</w:t>
             </w:r>
             <w:r>
               <w:rPr>
@@ -2921,7 +2995,7 @@
               <w14:ligatures w14:val="standardContextual"/>
             </w:rPr>
           </w:pPr>
-          <w:hyperlink w:anchor="_Toc226233175" w:history="1">
+          <w:hyperlink w:anchor="_Toc226299491" w:history="1">
             <w:r>
               <w:rPr>
                 <w:rStyle w:val="Hipervnculo"/>
@@ -2949,7 +3023,7 @@
                 <w:noProof/>
                 <w:webHidden/>
               </w:rPr>
-              <w:instrText xml:space="preserve"> PAGEREF _Toc226233175 \h </w:instrText>
+              <w:instrText xml:space="preserve"> PAGEREF _Toc226299491 \h </w:instrText>
             </w:r>
             <w:r>
               <w:rPr>
@@ -2969,7 +3043,7 @@
                 <w:noProof/>
                 <w:webHidden/>
               </w:rPr>
-              <w:t>15</w:t>
+              <w:t>16</w:t>
             </w:r>
             <w:r>
               <w:rPr>
@@ -2995,7 +3069,7 @@
               <w14:ligatures w14:val="standardContextual"/>
             </w:rPr>
           </w:pPr>
-          <w:hyperlink w:anchor="_Toc226233176" w:history="1">
+          <w:hyperlink w:anchor="_Toc226299492" w:history="1">
             <w:r>
               <w:rPr>
                 <w:rStyle w:val="Hipervnculo"/>
@@ -3023,7 +3097,7 @@
                 <w:noProof/>
                 <w:webHidden/>
               </w:rPr>
-              <w:instrText xml:space="preserve"> PAGEREF _Toc226233176 \h </w:instrText>
+              <w:instrText xml:space="preserve"> PAGEREF _Toc226299492 \h </w:instrText>
             </w:r>
             <w:r>
               <w:rPr>
@@ -3043,7 +3117,7 @@
                 <w:noProof/>
                 <w:webHidden/>
               </w:rPr>
-              <w:t>16</w:t>
+              <w:t>17</w:t>
             </w:r>
             <w:r>
               <w:rPr>
@@ -3069,7 +3143,7 @@
               <w14:ligatures w14:val="standardContextual"/>
             </w:rPr>
           </w:pPr>
-          <w:hyperlink w:anchor="_Toc226233177" w:history="1">
+          <w:hyperlink w:anchor="_Toc226299493" w:history="1">
             <w:r>
               <w:rPr>
                 <w:rStyle w:val="Hipervnculo"/>
@@ -3097,7 +3171,7 @@
                 <w:noProof/>
                 <w:webHidden/>
               </w:rPr>
-              <w:instrText xml:space="preserve"> PAGEREF _Toc226233177 \h </w:instrText>
+              <w:instrText xml:space="preserve"> PAGEREF _Toc226299493 \h </w:instrText>
             </w:r>
             <w:r>
               <w:rPr>
@@ -3117,7 +3191,7 @@
                 <w:noProof/>
                 <w:webHidden/>
               </w:rPr>
-              <w:t>18</w:t>
+              <w:t>19</w:t>
             </w:r>
             <w:r>
               <w:rPr>
@@ -3143,7 +3217,7 @@
               <w14:ligatures w14:val="standardContextual"/>
             </w:rPr>
           </w:pPr>
-          <w:hyperlink w:anchor="_Toc226233178" w:history="1">
+          <w:hyperlink w:anchor="_Toc226299494" w:history="1">
             <w:r>
               <w:rPr>
                 <w:rStyle w:val="Hipervnculo"/>
@@ -3171,7 +3245,7 @@
                 <w:noProof/>
                 <w:webHidden/>
               </w:rPr>
-              <w:instrText xml:space="preserve"> PAGEREF _Toc226233178 \h </w:instrText>
+              <w:instrText xml:space="preserve"> PAGEREF _Toc226299494 \h </w:instrText>
             </w:r>
             <w:r>
               <w:rPr>
@@ -3191,7 +3265,7 @@
                 <w:noProof/>
                 <w:webHidden/>
               </w:rPr>
-              <w:t>19</w:t>
+              <w:t>20</w:t>
             </w:r>
             <w:r>
               <w:rPr>
@@ -3217,7 +3291,7 @@
               <w14:ligatures w14:val="standardContextual"/>
             </w:rPr>
           </w:pPr>
-          <w:hyperlink w:anchor="_Toc226233179" w:history="1">
+          <w:hyperlink w:anchor="_Toc226299495" w:history="1">
             <w:r>
               <w:rPr>
                 <w:rStyle w:val="Hipervnculo"/>
@@ -3245,7 +3319,7 @@
                 <w:noProof/>
                 <w:webHidden/>
               </w:rPr>
-              <w:instrText xml:space="preserve"> PAGEREF _Toc226233179 \h </w:instrText>
+              <w:instrText xml:space="preserve"> PAGEREF _Toc226299495 \h </w:instrText>
             </w:r>
             <w:r>
               <w:rPr>
@@ -3265,7 +3339,7 @@
                 <w:noProof/>
                 <w:webHidden/>
               </w:rPr>
-              <w:t>20</w:t>
+              <w:t>21</w:t>
             </w:r>
             <w:r>
               <w:rPr>
@@ -3291,7 +3365,7 @@
               <w14:ligatures w14:val="standardContextual"/>
             </w:rPr>
           </w:pPr>
-          <w:hyperlink w:anchor="_Toc226233180" w:history="1">
+          <w:hyperlink w:anchor="_Toc226299496" w:history="1">
             <w:r>
               <w:rPr>
                 <w:rStyle w:val="Hipervnculo"/>
@@ -3319,7 +3393,7 @@
                 <w:noProof/>
                 <w:webHidden/>
               </w:rPr>
-              <w:instrText xml:space="preserve"> PAGEREF _Toc226233180 \h </w:instrText>
+              <w:instrText xml:space="preserve"> PAGEREF _Toc226299496 \h </w:instrText>
             </w:r>
             <w:r>
               <w:rPr>
@@ -3339,7 +3413,7 @@
                 <w:noProof/>
                 <w:webHidden/>
               </w:rPr>
-              <w:t>21</w:t>
+              <w:t>22</w:t>
             </w:r>
             <w:r>
               <w:rPr>
@@ -3381,7 +3455,7 @@
           <w:szCs w:val="24"/>
         </w:rPr>
       </w:pPr>
-      <w:bookmarkStart w:id="0" w:name="_Toc226233140"/>
+      <w:bookmarkStart w:id="0" w:name="_Toc226299455"/>
       <w:r>
         <w:rPr>
           <w:rFonts w:ascii="Times New Roman" w:hAnsi="Times New Roman" w:cs="Times New Roman"/>
@@ -3534,7 +3608,7 @@
           <w:szCs w:val="24"/>
         </w:rPr>
       </w:pPr>
-      <w:bookmarkStart w:id="1" w:name="_Toc226233141"/>
+      <w:bookmarkStart w:id="1" w:name="_Toc226299456"/>
       <w:r>
         <w:rPr>
           <w:rFonts w:ascii="Times New Roman" w:hAnsi="Times New Roman" w:cs="Times New Roman"/>
@@ -3556,7 +3630,7 @@
           <w:szCs w:val="24"/>
         </w:rPr>
       </w:pPr>
-      <w:bookmarkStart w:id="2" w:name="_Toc226233142"/>
+      <w:bookmarkStart w:id="2" w:name="_Toc226299457"/>
       <w:r>
         <w:rPr>
           <w:rFonts w:ascii="Times New Roman" w:hAnsi="Times New Roman" w:cs="Times New Roman"/>
@@ -3598,7 +3672,7 @@
           <w:szCs w:val="24"/>
         </w:rPr>
       </w:pPr>
-      <w:bookmarkStart w:id="3" w:name="_Toc226233143"/>
+      <w:bookmarkStart w:id="3" w:name="_Toc226299458"/>
       <w:r>
         <w:rPr>
           <w:rFonts w:ascii="Times New Roman" w:hAnsi="Times New Roman" w:cs="Times New Roman"/>
@@ -3640,7 +3714,7 @@
           <w:szCs w:val="24"/>
         </w:rPr>
       </w:pPr>
-      <w:bookmarkStart w:id="4" w:name="_Toc226233144"/>
+      <w:bookmarkStart w:id="4" w:name="_Toc226299459"/>
       <w:r>
         <w:rPr>
           <w:rFonts w:ascii="Times New Roman" w:hAnsi="Times New Roman" w:cs="Times New Roman"/>
@@ -3682,7 +3756,7 @@
           <w:szCs w:val="24"/>
         </w:rPr>
       </w:pPr>
-      <w:bookmarkStart w:id="5" w:name="_Toc226233145"/>
+      <w:bookmarkStart w:id="5" w:name="_Toc226299460"/>
       <w:r>
         <w:rPr>
           <w:rFonts w:ascii="Times New Roman" w:hAnsi="Times New Roman" w:cs="Times New Roman"/>
@@ -3724,7 +3798,7 @@
           <w:szCs w:val="24"/>
         </w:rPr>
       </w:pPr>
-      <w:bookmarkStart w:id="6" w:name="_Toc226233146"/>
+      <w:bookmarkStart w:id="6" w:name="_Toc226299461"/>
       <w:r>
         <w:rPr>
           <w:rFonts w:ascii="Times New Roman" w:hAnsi="Times New Roman" w:cs="Times New Roman"/>
@@ -3812,7 +3886,7 @@
           <w:szCs w:val="24"/>
         </w:rPr>
       </w:pPr>
-      <w:bookmarkStart w:id="7" w:name="_Toc226233147"/>
+      <w:bookmarkStart w:id="7" w:name="_Toc226299462"/>
       <w:r>
         <w:rPr>
           <w:rFonts w:ascii="Times New Roman" w:hAnsi="Times New Roman" w:cs="Times New Roman"/>
@@ -3834,7 +3908,7 @@
           <w:szCs w:val="24"/>
         </w:rPr>
       </w:pPr>
-      <w:bookmarkStart w:id="8" w:name="_Toc226233148"/>
+      <w:bookmarkStart w:id="8" w:name="_Toc226299463"/>
       <w:r>
         <w:rPr>
           <w:rFonts w:ascii="Times New Roman" w:hAnsi="Times New Roman" w:cs="Times New Roman"/>
@@ -3930,7 +4004,7 @@
           <w:szCs w:val="24"/>
         </w:rPr>
       </w:pPr>
-      <w:bookmarkStart w:id="9" w:name="_Toc226233149"/>
+      <w:bookmarkStart w:id="9" w:name="_Toc226299464"/>
       <w:r>
         <w:rPr>
           <w:rFonts w:ascii="Times New Roman" w:hAnsi="Times New Roman" w:cs="Times New Roman"/>
@@ -4149,7 +4223,7 @@
           <w:szCs w:val="24"/>
         </w:rPr>
       </w:pPr>
-      <w:bookmarkStart w:id="10" w:name="_Toc226233150"/>
+      <w:bookmarkStart w:id="10" w:name="_Toc226299465"/>
       <w:r>
         <w:rPr>
           <w:rFonts w:ascii="Times New Roman" w:hAnsi="Times New Roman" w:cs="Times New Roman"/>
@@ -4171,7 +4245,7 @@
           <w:szCs w:val="24"/>
         </w:rPr>
       </w:pPr>
-      <w:bookmarkStart w:id="11" w:name="_Toc226233151"/>
+      <w:bookmarkStart w:id="11" w:name="_Toc226299466"/>
       <w:r>
         <w:rPr>
           <w:rFonts w:ascii="Times New Roman" w:hAnsi="Times New Roman" w:cs="Times New Roman"/>
@@ -4447,7 +4521,7 @@
           <w:szCs w:val="24"/>
         </w:rPr>
       </w:pPr>
-      <w:bookmarkStart w:id="12" w:name="_Toc226233152"/>
+      <w:bookmarkStart w:id="12" w:name="_Toc226299467"/>
       <w:r>
         <w:rPr>
           <w:rFonts w:ascii="Times New Roman" w:hAnsi="Times New Roman" w:cs="Times New Roman"/>
@@ -4561,7 +4635,7 @@
           <w:szCs w:val="24"/>
         </w:rPr>
       </w:pPr>
-      <w:bookmarkStart w:id="13" w:name="_Toc226233153"/>
+      <w:bookmarkStart w:id="13" w:name="_Toc226299468"/>
       <w:r>
         <w:rPr>
           <w:rFonts w:ascii="Times New Roman" w:hAnsi="Times New Roman" w:cs="Times New Roman"/>
@@ -4685,7 +4759,7 @@
           <w:szCs w:val="24"/>
         </w:rPr>
       </w:pPr>
-      <w:bookmarkStart w:id="14" w:name="_Toc226233154"/>
+      <w:bookmarkStart w:id="14" w:name="_Toc226299469"/>
       <w:r>
         <w:rPr>
           <w:rFonts w:ascii="Times New Roman" w:hAnsi="Times New Roman" w:cs="Times New Roman"/>
@@ -4707,7 +4781,7 @@
           <w:szCs w:val="24"/>
         </w:rPr>
       </w:pPr>
-      <w:bookmarkStart w:id="15" w:name="_Toc226233155"/>
+      <w:bookmarkStart w:id="15" w:name="_Toc226299470"/>
       <w:r>
         <w:rPr>
           <w:rFonts w:ascii="Times New Roman" w:hAnsi="Times New Roman" w:cs="Times New Roman"/>
@@ -4803,7 +4877,7 @@
           <w:szCs w:val="24"/>
         </w:rPr>
       </w:pPr>
-      <w:bookmarkStart w:id="16" w:name="_Toc226233156"/>
+      <w:bookmarkStart w:id="16" w:name="_Toc226299471"/>
       <w:r>
         <w:rPr>
           <w:rFonts w:ascii="Times New Roman" w:hAnsi="Times New Roman" w:cs="Times New Roman"/>
@@ -4968,7 +5042,7 @@
           <w:szCs w:val="24"/>
         </w:rPr>
       </w:pPr>
-      <w:bookmarkStart w:id="17" w:name="_Toc226233157"/>
+      <w:bookmarkStart w:id="17" w:name="_Toc226299472"/>
       <w:r>
         <w:rPr>
           <w:rFonts w:ascii="Times New Roman" w:hAnsi="Times New Roman" w:cs="Times New Roman"/>
@@ -5071,10 +5145,9 @@
         <w:pStyle w:val="font-claude-response-body"/>
         <w:numPr>
           <w:ilvl w:val="0"/>
-          <w:numId w:val="2"/>
+          <w:numId w:val="4"/>
         </w:numPr>
       </w:pPr>
-      <w:bookmarkStart w:id="18" w:name="_Toc226233158"/>
       <w:r>
         <w:rPr>
           <w:rStyle w:val="Fuerte"/>
@@ -5201,6 +5274,7 @@
           <w:szCs w:val="24"/>
         </w:rPr>
       </w:pPr>
+      <w:bookmarkStart w:id="18" w:name="_Toc226299473"/>
       <w:r>
         <w:rPr>
           <w:rFonts w:ascii="Times New Roman" w:hAnsi="Times New Roman" w:cs="Times New Roman"/>
@@ -5208,9 +5282,335 @@
           <w:sz w:val="24"/>
           <w:szCs w:val="24"/>
         </w:rPr>
+        <w:lastRenderedPageBreak/>
+        <w:t>4.3</w:t>
+      </w:r>
+      <w:r>
+        <w:rPr>
+          <w:rFonts w:ascii="Times New Roman" w:hAnsi="Times New Roman" w:cs="Times New Roman"/>
+          <w:color w:val="auto"/>
+          <w:sz w:val="24"/>
+          <w:szCs w:val="24"/>
+        </w:rPr>
+        <w:t>.1</w:t>
+      </w:r>
+      <w:r>
+        <w:rPr>
+          <w:rFonts w:ascii="Times New Roman" w:hAnsi="Times New Roman" w:cs="Times New Roman"/>
+          <w:color w:val="auto"/>
+          <w:sz w:val="24"/>
+          <w:szCs w:val="24"/>
+        </w:rPr>
+        <w:t xml:space="preserve"> </w:t>
+      </w:r>
+      <w:bookmarkStart w:id="19" w:name="_Toc226299144"/>
+      <w:r>
+        <w:rPr>
+          <w:rFonts w:ascii="Times New Roman" w:hAnsi="Times New Roman" w:cs="Times New Roman"/>
+          <w:color w:val="auto"/>
+          <w:sz w:val="24"/>
+          <w:szCs w:val="24"/>
+        </w:rPr>
+        <w:t xml:space="preserve">planeación del sprint 1 </w:t>
+      </w:r>
+      <w:r>
+        <w:rPr>
+          <w:rFonts w:ascii="Times New Roman" w:hAnsi="Times New Roman" w:cs="Times New Roman"/>
+          <w:color w:val="auto"/>
+          <w:sz w:val="24"/>
+          <w:szCs w:val="24"/>
+        </w:rPr>
+        <w:br/>
+      </w:r>
+      <w:bookmarkEnd w:id="19"/>
+      <w:r>
+        <w:rPr>
+          <w:rFonts w:ascii="Times New Roman" w:hAnsi="Times New Roman" w:cs="Times New Roman"/>
+          <w:color w:val="auto"/>
+          <w:sz w:val="24"/>
+          <w:szCs w:val="24"/>
+        </w:rPr>
+        <w:t xml:space="preserve">    </w:t>
+      </w:r>
+      <w:r>
+        <w:rPr>
+          <w:rFonts w:ascii="Times New Roman" w:hAnsi="Times New Roman" w:cs="Times New Roman"/>
+          <w:color w:val="auto"/>
+          <w:sz w:val="24"/>
+          <w:szCs w:val="24"/>
+        </w:rPr>
+        <w:drawing>
+          <wp:inline distT="0" distB="0" distL="0" distR="0" wp14:anchorId="1A8CEC89" wp14:editId="050404FE">
+            <wp:extent cx="5731510" cy="2167890"/>
+            <wp:effectExtent l="0" t="0" r="2540" b="3810"/>
+            <wp:docPr id="1838559872" name="Imagen 1"/>
+            <wp:cNvGraphicFramePr>
+              <a:graphicFrameLocks xmlns:a="http://schemas.openxmlformats.org/drawingml/2006/main" noChangeAspect="1"/>
+            </wp:cNvGraphicFramePr>
+            <a:graphic xmlns:a="http://schemas.openxmlformats.org/drawingml/2006/main">
+              <a:graphicData uri="http://schemas.openxmlformats.org/drawingml/2006/picture">
+                <pic:pic xmlns:pic="http://schemas.openxmlformats.org/drawingml/2006/picture">
+                  <pic:nvPicPr>
+                    <pic:cNvPr id="1838559872" name=""/>
+                    <pic:cNvPicPr/>
+                  </pic:nvPicPr>
+                  <pic:blipFill>
+                    <a:blip r:embed="rId8"/>
+                    <a:stretch>
+                      <a:fillRect/>
+                    </a:stretch>
+                  </pic:blipFill>
+                  <pic:spPr>
+                    <a:xfrm>
+                      <a:off x="0" y="0"/>
+                      <a:ext cx="5731510" cy="2167890"/>
+                    </a:xfrm>
+                    <a:prstGeom prst="rect">
+                      <a:avLst/>
+                    </a:prstGeom>
+                  </pic:spPr>
+                </pic:pic>
+              </a:graphicData>
+            </a:graphic>
+          </wp:inline>
+        </w:drawing>
+      </w:r>
+      <w:bookmarkEnd w:id="18"/>
+    </w:p>
+    <w:p>
+      <w:pPr>
+        <w:spacing w:before="40" w:after="200"/>
+        <w:jc w:val="center"/>
+        <w:rPr>
+          <w:rFonts w:ascii="Times New Roman" w:hAnsi="Times New Roman" w:cs="Times New Roman"/>
+          <w:sz w:val="24"/>
+          <w:szCs w:val="24"/>
+          <w:lang w:val="en-US"/>
+        </w:rPr>
+      </w:pPr>
+      <w:proofErr w:type="spellStart"/>
+      <w:r>
+        <w:rPr>
+          <w:rFonts w:ascii="Times New Roman" w:hAnsi="Times New Roman" w:cs="Times New Roman"/>
+          <w:i/>
+          <w:iCs/>
+          <w:sz w:val="24"/>
+          <w:szCs w:val="24"/>
+          <w:lang w:val="en-US"/>
+        </w:rPr>
+        <w:t>Figura</w:t>
+      </w:r>
+      <w:proofErr w:type="spellEnd"/>
+      <w:r>
+        <w:rPr>
+          <w:rFonts w:ascii="Times New Roman" w:hAnsi="Times New Roman" w:cs="Times New Roman"/>
+          <w:i/>
+          <w:iCs/>
+          <w:sz w:val="24"/>
+          <w:szCs w:val="24"/>
+          <w:lang w:val="en-US"/>
+        </w:rPr>
+        <w:t xml:space="preserve"> 1. </w:t>
+      </w:r>
+      <w:proofErr w:type="gramStart"/>
+      <w:r>
+        <w:rPr>
+          <w:rFonts w:ascii="Times New Roman" w:hAnsi="Times New Roman" w:cs="Times New Roman"/>
+          <w:i/>
+          <w:iCs/>
+          <w:sz w:val="24"/>
+          <w:szCs w:val="24"/>
+          <w:lang w:val="en-US"/>
+        </w:rPr>
+        <w:t>Time line</w:t>
+      </w:r>
+      <w:proofErr w:type="gramEnd"/>
+      <w:r>
+        <w:rPr>
+          <w:rFonts w:ascii="Times New Roman" w:hAnsi="Times New Roman" w:cs="Times New Roman"/>
+          <w:i/>
+          <w:iCs/>
+          <w:sz w:val="24"/>
+          <w:szCs w:val="24"/>
+          <w:lang w:val="en-US"/>
+        </w:rPr>
+        <w:t xml:space="preserve"> sprint 1 —</w:t>
+      </w:r>
+      <w:r>
+        <w:rPr>
+          <w:rFonts w:ascii="Times New Roman" w:hAnsi="Times New Roman" w:cs="Times New Roman"/>
+          <w:i/>
+          <w:iCs/>
+          <w:sz w:val="24"/>
+          <w:szCs w:val="24"/>
+          <w:lang w:val="en-US"/>
+        </w:rPr>
+        <w:t xml:space="preserve"> </w:t>
+      </w:r>
+      <w:proofErr w:type="spellStart"/>
+      <w:r>
+        <w:rPr>
+          <w:rFonts w:ascii="Times New Roman" w:hAnsi="Times New Roman" w:cs="Times New Roman"/>
+          <w:i/>
+          <w:iCs/>
+          <w:sz w:val="24"/>
+          <w:szCs w:val="24"/>
+          <w:lang w:val="en-US"/>
+        </w:rPr>
+        <w:t>MindBalance</w:t>
+      </w:r>
+      <w:bookmarkStart w:id="20" w:name="_Toc226299145"/>
+      <w:proofErr w:type="spellEnd"/>
+      <w:r>
+        <w:rPr>
+          <w:noProof/>
+          <w:color w:val="000000" w:themeColor="text1"/>
+        </w:rPr>
+        <w:drawing>
+          <wp:inline distT="0" distB="0" distL="0" distR="0" wp14:anchorId="5987C296" wp14:editId="4840D9F2">
+            <wp:extent cx="5486400" cy="3083560"/>
+            <wp:effectExtent l="0" t="0" r="0" b="2540"/>
+            <wp:docPr id="280668265" name="Imagen 1"/>
+            <wp:cNvGraphicFramePr>
+              <a:graphicFrameLocks xmlns:a="http://schemas.openxmlformats.org/drawingml/2006/main" noChangeAspect="1"/>
+            </wp:cNvGraphicFramePr>
+            <a:graphic xmlns:a="http://schemas.openxmlformats.org/drawingml/2006/main">
+              <a:graphicData uri="http://schemas.openxmlformats.org/drawingml/2006/picture">
+                <pic:pic xmlns:pic="http://schemas.openxmlformats.org/drawingml/2006/picture">
+                  <pic:nvPicPr>
+                    <pic:cNvPr id="280668265" name=""/>
+                    <pic:cNvPicPr/>
+                  </pic:nvPicPr>
+                  <pic:blipFill>
+                    <a:blip r:embed="rId9"/>
+                    <a:stretch>
+                      <a:fillRect/>
+                    </a:stretch>
+                  </pic:blipFill>
+                  <pic:spPr>
+                    <a:xfrm>
+                      <a:off x="0" y="0"/>
+                      <a:ext cx="5486400" cy="3083560"/>
+                    </a:xfrm>
+                    <a:prstGeom prst="rect">
+                      <a:avLst/>
+                    </a:prstGeom>
+                  </pic:spPr>
+                </pic:pic>
+              </a:graphicData>
+            </a:graphic>
+          </wp:inline>
+        </w:drawing>
+      </w:r>
+      <w:bookmarkEnd w:id="20"/>
+    </w:p>
+    <w:p>
+      <w:pPr>
+        <w:spacing w:before="40" w:after="200"/>
+        <w:jc w:val="center"/>
+        <w:rPr>
+          <w:rFonts w:ascii="Times New Roman" w:hAnsi="Times New Roman" w:cs="Times New Roman"/>
+          <w:sz w:val="24"/>
+          <w:szCs w:val="24"/>
+          <w:lang w:val="en-US"/>
+        </w:rPr>
+      </w:pPr>
+      <w:r>
+        <w:rPr>
+          <w:rStyle w:val="Fuerte"/>
+          <w:lang w:val="en-US"/>
+        </w:rPr>
+        <w:tab/>
+      </w:r>
+      <w:proofErr w:type="spellStart"/>
+      <w:r>
+        <w:rPr>
+          <w:rFonts w:ascii="Times New Roman" w:hAnsi="Times New Roman" w:cs="Times New Roman"/>
+          <w:i/>
+          <w:iCs/>
+          <w:sz w:val="24"/>
+          <w:szCs w:val="24"/>
+          <w:lang w:val="en-US"/>
+        </w:rPr>
+        <w:t>Figura</w:t>
+      </w:r>
+      <w:proofErr w:type="spellEnd"/>
+      <w:r>
+        <w:rPr>
+          <w:rFonts w:ascii="Times New Roman" w:hAnsi="Times New Roman" w:cs="Times New Roman"/>
+          <w:i/>
+          <w:iCs/>
+          <w:sz w:val="24"/>
+          <w:szCs w:val="24"/>
+          <w:lang w:val="en-US"/>
+        </w:rPr>
+        <w:t xml:space="preserve"> </w:t>
+      </w:r>
+      <w:r>
+        <w:rPr>
+          <w:rFonts w:ascii="Times New Roman" w:hAnsi="Times New Roman" w:cs="Times New Roman"/>
+          <w:i/>
+          <w:iCs/>
+          <w:sz w:val="24"/>
+          <w:szCs w:val="24"/>
+          <w:lang w:val="en-US"/>
+        </w:rPr>
+        <w:t>2</w:t>
+      </w:r>
+      <w:r>
+        <w:rPr>
+          <w:rFonts w:ascii="Times New Roman" w:hAnsi="Times New Roman" w:cs="Times New Roman"/>
+          <w:i/>
+          <w:iCs/>
+          <w:sz w:val="24"/>
+          <w:szCs w:val="24"/>
+          <w:lang w:val="en-US"/>
+        </w:rPr>
+        <w:t xml:space="preserve">. Sprint Planning   — </w:t>
+      </w:r>
+      <w:proofErr w:type="spellStart"/>
+      <w:r>
+        <w:rPr>
+          <w:rFonts w:ascii="Times New Roman" w:hAnsi="Times New Roman" w:cs="Times New Roman"/>
+          <w:i/>
+          <w:iCs/>
+          <w:sz w:val="24"/>
+          <w:szCs w:val="24"/>
+          <w:lang w:val="en-US"/>
+        </w:rPr>
+        <w:t>MindBalance</w:t>
+      </w:r>
+      <w:proofErr w:type="spellEnd"/>
+    </w:p>
+    <w:p>
+      <w:pPr>
+        <w:pStyle w:val="font-claude-response-body"/>
+        <w:rPr>
+          <w:lang w:val="en-US"/>
+        </w:rPr>
+      </w:pPr>
+    </w:p>
+    <w:p>
+      <w:pPr>
+        <w:pStyle w:val="Ttulo2"/>
+        <w:rPr>
+          <w:rFonts w:ascii="Times New Roman" w:hAnsi="Times New Roman" w:cs="Times New Roman"/>
+          <w:color w:val="auto"/>
+          <w:sz w:val="24"/>
+          <w:szCs w:val="24"/>
+        </w:rPr>
+      </w:pPr>
+      <w:bookmarkStart w:id="21" w:name="_Toc226299474"/>
+      <w:r>
+        <w:rPr>
+          <w:rFonts w:ascii="Times New Roman" w:hAnsi="Times New Roman" w:cs="Times New Roman"/>
+          <w:color w:val="auto"/>
+          <w:sz w:val="24"/>
+          <w:szCs w:val="24"/>
+        </w:rPr>
         <w:t>4.4 Herramientas de Gestión</w:t>
       </w:r>
-      <w:bookmarkEnd w:id="18"/>
+      <w:bookmarkEnd w:id="21"/>
     </w:p>
     <w:p>
       <w:pPr>
@@ -5297,7 +5697,6 @@
           <w:sz w:val="24"/>
           <w:szCs w:val="24"/>
         </w:rPr>
-        <w:lastRenderedPageBreak/>
         <w:t xml:space="preserve">GitHub: Control de versiones con ramas por </w:t>
       </w:r>
       <w:proofErr w:type="spellStart"/>
@@ -5408,7 +5807,7 @@
           <w:szCs w:val="24"/>
         </w:rPr>
       </w:pPr>
-      <w:bookmarkStart w:id="19" w:name="_Toc226233159"/>
+      <w:bookmarkStart w:id="22" w:name="_Toc226299475"/>
       <w:r>
         <w:rPr>
           <w:rFonts w:ascii="Times New Roman" w:hAnsi="Times New Roman" w:cs="Times New Roman"/>
@@ -5418,7 +5817,7 @@
         </w:rPr>
         <w:t>5. Requisitos del Sistema</w:t>
       </w:r>
-      <w:bookmarkEnd w:id="19"/>
+      <w:bookmarkEnd w:id="22"/>
     </w:p>
     <w:p>
       <w:pPr>
@@ -5430,7 +5829,7 @@
           <w:szCs w:val="24"/>
         </w:rPr>
       </w:pPr>
-      <w:bookmarkStart w:id="20" w:name="_Toc226233160"/>
+      <w:bookmarkStart w:id="23" w:name="_Toc226299476"/>
       <w:r>
         <w:rPr>
           <w:rFonts w:ascii="Times New Roman" w:hAnsi="Times New Roman" w:cs="Times New Roman"/>
@@ -5440,7 +5839,7 @@
         </w:rPr>
         <w:t>5.1 Requisitos Funcionales</w:t>
       </w:r>
-      <w:bookmarkEnd w:id="20"/>
+      <w:bookmarkEnd w:id="23"/>
     </w:p>
     <w:p>
       <w:pPr>
@@ -7042,7 +7441,6 @@
                 <w:sz w:val="24"/>
                 <w:szCs w:val="24"/>
               </w:rPr>
-              <w:lastRenderedPageBreak/>
               <w:t>RF13</w:t>
             </w:r>
           </w:p>
@@ -7257,7 +7655,7 @@
           <w:szCs w:val="24"/>
         </w:rPr>
       </w:pPr>
-      <w:bookmarkStart w:id="21" w:name="_Toc226233161"/>
+      <w:bookmarkStart w:id="24" w:name="_Toc226299477"/>
       <w:r>
         <w:rPr>
           <w:rFonts w:ascii="Times New Roman" w:hAnsi="Times New Roman" w:cs="Times New Roman"/>
@@ -7267,7 +7665,7 @@
         </w:rPr>
         <w:t>5.2 Requisitos No Funcionales</w:t>
       </w:r>
-      <w:bookmarkEnd w:id="21"/>
+      <w:bookmarkEnd w:id="24"/>
     </w:p>
     <w:p>
       <w:pPr>
@@ -8251,7 +8649,7 @@
           <w:szCs w:val="24"/>
         </w:rPr>
       </w:pPr>
-      <w:bookmarkStart w:id="22" w:name="_Toc226233162"/>
+      <w:bookmarkStart w:id="25" w:name="_Toc226299478"/>
       <w:r>
         <w:rPr>
           <w:rFonts w:ascii="Times New Roman" w:hAnsi="Times New Roman" w:cs="Times New Roman"/>
@@ -8281,7 +8679,7 @@
         </w:rPr>
         <w:t xml:space="preserve"> y Usuarios Finales</w:t>
       </w:r>
-      <w:bookmarkEnd w:id="22"/>
+      <w:bookmarkEnd w:id="25"/>
     </w:p>
     <w:p>
       <w:pPr>
@@ -8293,7 +8691,7 @@
           <w:szCs w:val="24"/>
         </w:rPr>
       </w:pPr>
-      <w:bookmarkStart w:id="23" w:name="_Toc226233163"/>
+      <w:bookmarkStart w:id="26" w:name="_Toc226299479"/>
       <w:r>
         <w:rPr>
           <w:rFonts w:ascii="Times New Roman" w:hAnsi="Times New Roman" w:cs="Times New Roman"/>
@@ -8313,7 +8711,7 @@
         </w:rPr>
         <w:t>Stakeholders</w:t>
       </w:r>
-      <w:bookmarkEnd w:id="23"/>
+      <w:bookmarkEnd w:id="26"/>
       <w:proofErr w:type="spellEnd"/>
     </w:p>
     <w:p>
@@ -8418,7 +8816,7 @@
           <w:szCs w:val="24"/>
         </w:rPr>
       </w:pPr>
-      <w:bookmarkStart w:id="24" w:name="_Toc226233164"/>
+      <w:bookmarkStart w:id="27" w:name="_Toc226299480"/>
       <w:r>
         <w:rPr>
           <w:rFonts w:ascii="Times New Roman" w:hAnsi="Times New Roman" w:cs="Times New Roman"/>
@@ -8428,7 +8826,7 @@
         </w:rPr>
         <w:t>6.2 Usuarios Finales</w:t>
       </w:r>
-      <w:bookmarkEnd w:id="24"/>
+      <w:bookmarkEnd w:id="27"/>
     </w:p>
     <w:p>
       <w:pPr>
@@ -8447,7 +8845,6 @@
           <w:sz w:val="24"/>
           <w:szCs w:val="24"/>
         </w:rPr>
-        <w:lastRenderedPageBreak/>
         <w:t>Estudiantes universitarios activos entre 16 y 40 años que tengan la necesidad de llevar un registro de sus emociones, gestionar hábitos saludables y acceder a orientación preventiva sin barreras de acceso ni estigma social.</w:t>
       </w:r>
     </w:p>
@@ -8471,7 +8868,7 @@
           <w:szCs w:val="24"/>
         </w:rPr>
       </w:pPr>
-      <w:bookmarkStart w:id="25" w:name="_Toc226233165"/>
+      <w:bookmarkStart w:id="28" w:name="_Toc226299481"/>
       <w:r>
         <w:rPr>
           <w:rFonts w:ascii="Times New Roman" w:hAnsi="Times New Roman" w:cs="Times New Roman"/>
@@ -8481,7 +8878,7 @@
         </w:rPr>
         <w:t>7. Historias de Usuario</w:t>
       </w:r>
-      <w:bookmarkEnd w:id="25"/>
+      <w:bookmarkEnd w:id="28"/>
     </w:p>
     <w:p>
       <w:pPr>
@@ -8641,6 +9038,7 @@
                 <w:sz w:val="24"/>
                 <w:szCs w:val="24"/>
               </w:rPr>
+              <w:lastRenderedPageBreak/>
               <w:t>HU01</w:t>
             </w:r>
           </w:p>
@@ -9773,7 +10171,7 @@
           <w:szCs w:val="24"/>
         </w:rPr>
       </w:pPr>
-      <w:bookmarkStart w:id="26" w:name="_Toc226233166"/>
+      <w:bookmarkStart w:id="29" w:name="_Toc226299482"/>
       <w:r>
         <w:rPr>
           <w:rFonts w:ascii="Times New Roman" w:hAnsi="Times New Roman" w:cs="Times New Roman"/>
@@ -9783,7 +10181,7 @@
         </w:rPr>
         <w:t>8. Casos de Uso</w:t>
       </w:r>
-      <w:bookmarkEnd w:id="26"/>
+      <w:bookmarkEnd w:id="29"/>
     </w:p>
     <w:p>
       <w:pPr>
@@ -9795,7 +10193,7 @@
           <w:szCs w:val="24"/>
         </w:rPr>
       </w:pPr>
-      <w:bookmarkStart w:id="27" w:name="_Toc226233167"/>
+      <w:bookmarkStart w:id="30" w:name="_Toc226299483"/>
       <w:r>
         <w:rPr>
           <w:rFonts w:ascii="Times New Roman" w:hAnsi="Times New Roman" w:cs="Times New Roman"/>
@@ -9803,10 +10201,9 @@
           <w:sz w:val="24"/>
           <w:szCs w:val="24"/>
         </w:rPr>
-        <w:lastRenderedPageBreak/>
         <w:t>8.1 Diagrama de Casos de Uso</w:t>
       </w:r>
-      <w:bookmarkEnd w:id="27"/>
+      <w:bookmarkEnd w:id="30"/>
     </w:p>
     <w:p>
       <w:pPr>
@@ -9826,6 +10223,7 @@
           <w:sz w:val="24"/>
           <w:szCs w:val="24"/>
         </w:rPr>
+        <w:lastRenderedPageBreak/>
         <w:drawing>
           <wp:inline distT="0" distB="0" distL="0" distR="0" wp14:anchorId="50D97B2B" wp14:editId="67D5CD2E">
             <wp:extent cx="5731510" cy="6045835"/>
@@ -9844,7 +10242,7 @@
                     </pic:cNvPicPr>
                   </pic:nvPicPr>
                   <pic:blipFill>
-                    <a:blip r:embed="rId6">
+                    <a:blip r:embed="rId10">
                       <a:extLst>
                         <a:ext uri="{28A0092B-C50C-407E-A947-70E740481C1C}">
                           <a14:useLocalDpi xmlns:a14="http://schemas.microsoft.com/office/drawing/2010/main" val="0"/>
@@ -9894,7 +10292,27 @@
           <w:sz w:val="24"/>
           <w:szCs w:val="24"/>
         </w:rPr>
-        <w:t xml:space="preserve">Figura 1. Diagrama de Casos de Uso — </w:t>
+        <w:t xml:space="preserve">Figura </w:t>
+      </w:r>
+      <w:r>
+        <w:rPr>
+          <w:rFonts w:ascii="Times New Roman" w:hAnsi="Times New Roman" w:cs="Times New Roman"/>
+          <w:i/>
+          <w:iCs/>
+          <w:sz w:val="24"/>
+          <w:szCs w:val="24"/>
+        </w:rPr>
+        <w:t>3</w:t>
+      </w:r>
+      <w:r>
+        <w:rPr>
+          <w:rFonts w:ascii="Times New Roman" w:hAnsi="Times New Roman" w:cs="Times New Roman"/>
+          <w:i/>
+          <w:iCs/>
+          <w:sz w:val="24"/>
+          <w:szCs w:val="24"/>
+        </w:rPr>
+        <w:t xml:space="preserve">. Diagrama de Casos de Uso — </w:t>
       </w:r>
       <w:proofErr w:type="spellStart"/>
       <w:r>
@@ -9929,7 +10347,7 @@
           <w:szCs w:val="24"/>
         </w:rPr>
       </w:pPr>
-      <w:bookmarkStart w:id="28" w:name="_Toc226233168"/>
+      <w:bookmarkStart w:id="31" w:name="_Toc226299484"/>
       <w:r>
         <w:rPr>
           <w:rFonts w:ascii="Times New Roman" w:hAnsi="Times New Roman" w:cs="Times New Roman"/>
@@ -9939,7 +10357,7 @@
         </w:rPr>
         <w:t>8.2 Documentación de Casos de Uso</w:t>
       </w:r>
-      <w:bookmarkEnd w:id="28"/>
+      <w:bookmarkEnd w:id="31"/>
     </w:p>
     <w:p>
       <w:pPr>
@@ -10220,7 +10638,6 @@
                 <w:sz w:val="24"/>
                 <w:szCs w:val="24"/>
               </w:rPr>
-              <w:lastRenderedPageBreak/>
               <w:t>Precondiciones</w:t>
             </w:r>
           </w:p>
@@ -10301,6 +10718,7 @@
                 <w:sz w:val="24"/>
                 <w:szCs w:val="24"/>
               </w:rPr>
+              <w:lastRenderedPageBreak/>
               <w:t>Flujo Principal</w:t>
             </w:r>
           </w:p>
@@ -11760,6 +12178,7 @@
                 <w:sz w:val="24"/>
                 <w:szCs w:val="24"/>
               </w:rPr>
+              <w:lastRenderedPageBreak/>
               <w:t>CU-04: Gestionar Micro-Hábitos</w:t>
             </w:r>
           </w:p>
@@ -13274,25 +13693,25 @@
                 <w:sz w:val="24"/>
                 <w:szCs w:val="24"/>
               </w:rPr>
+              <w:t>3. El motor de reglas evalúa el estado contra umbrales predefinidos.</w:t>
+            </w:r>
+          </w:p>
+          <w:p>
+            <w:pPr>
+              <w:spacing w:before="40" w:after="40"/>
+              <w:rPr>
+                <w:rFonts w:ascii="Times New Roman" w:hAnsi="Times New Roman" w:cs="Times New Roman"/>
+                <w:sz w:val="24"/>
+                <w:szCs w:val="24"/>
+              </w:rPr>
+            </w:pPr>
+            <w:r>
+              <w:rPr>
+                <w:rFonts w:ascii="Times New Roman" w:hAnsi="Times New Roman" w:cs="Times New Roman"/>
+                <w:sz w:val="24"/>
+                <w:szCs w:val="24"/>
+              </w:rPr>
               <w:lastRenderedPageBreak/>
-              <w:t>3. El motor de reglas evalúa el estado contra umbrales predefinidos.</w:t>
-            </w:r>
-          </w:p>
-          <w:p>
-            <w:pPr>
-              <w:spacing w:before="40" w:after="40"/>
-              <w:rPr>
-                <w:rFonts w:ascii="Times New Roman" w:hAnsi="Times New Roman" w:cs="Times New Roman"/>
-                <w:sz w:val="24"/>
-                <w:szCs w:val="24"/>
-              </w:rPr>
-            </w:pPr>
-            <w:r>
-              <w:rPr>
-                <w:rFonts w:ascii="Times New Roman" w:hAnsi="Times New Roman" w:cs="Times New Roman"/>
-                <w:sz w:val="24"/>
-                <w:szCs w:val="24"/>
-              </w:rPr>
               <w:t>4. El sistema genera recomendaciones específicas para el nivel detectado.</w:t>
             </w:r>
           </w:p>
@@ -14526,7 +14945,6 @@
                 <w:sz w:val="24"/>
                 <w:szCs w:val="24"/>
               </w:rPr>
-              <w:lastRenderedPageBreak/>
               <w:t>CU-09: Editar Perfil</w:t>
             </w:r>
           </w:p>
@@ -14572,6 +14990,7 @@
                 <w:sz w:val="24"/>
                 <w:szCs w:val="24"/>
               </w:rPr>
+              <w:lastRenderedPageBreak/>
               <w:t>Descripción</w:t>
             </w:r>
           </w:p>
@@ -15473,7 +15892,7 @@
           <w:szCs w:val="24"/>
         </w:rPr>
       </w:pPr>
-      <w:bookmarkStart w:id="29" w:name="_Toc226233169"/>
+      <w:bookmarkStart w:id="32" w:name="_Toc226299485"/>
       <w:r>
         <w:rPr>
           <w:rFonts w:ascii="Times New Roman" w:hAnsi="Times New Roman" w:cs="Times New Roman"/>
@@ -15483,7 +15902,7 @@
         </w:rPr>
         <w:t>9. Flujos de Solución</w:t>
       </w:r>
-      <w:bookmarkEnd w:id="29"/>
+      <w:bookmarkEnd w:id="32"/>
     </w:p>
     <w:p>
       <w:pPr>
@@ -15842,7 +16261,7 @@
           <w:szCs w:val="24"/>
         </w:rPr>
       </w:pPr>
-      <w:bookmarkStart w:id="30" w:name="_Toc226233170"/>
+      <w:bookmarkStart w:id="33" w:name="_Toc226299486"/>
       <w:r>
         <w:rPr>
           <w:rFonts w:ascii="Times New Roman" w:hAnsi="Times New Roman" w:cs="Times New Roman"/>
@@ -15852,7 +16271,7 @@
         </w:rPr>
         <w:t>10. Solución Tecnológica</w:t>
       </w:r>
-      <w:bookmarkEnd w:id="30"/>
+      <w:bookmarkEnd w:id="33"/>
     </w:p>
     <w:p>
       <w:pPr>
@@ -15864,7 +16283,7 @@
           <w:szCs w:val="24"/>
         </w:rPr>
       </w:pPr>
-      <w:bookmarkStart w:id="31" w:name="_Toc226233171"/>
+      <w:bookmarkStart w:id="34" w:name="_Toc226299487"/>
       <w:r>
         <w:rPr>
           <w:rFonts w:ascii="Times New Roman" w:hAnsi="Times New Roman" w:cs="Times New Roman"/>
@@ -15874,7 +16293,7 @@
         </w:rPr>
         <w:t>10.1 Arquitectura del Sistema</w:t>
       </w:r>
-      <w:bookmarkEnd w:id="31"/>
+      <w:bookmarkEnd w:id="34"/>
     </w:p>
     <w:p>
       <w:pPr>
@@ -16006,7 +16425,7 @@
           <w:szCs w:val="24"/>
         </w:rPr>
       </w:pPr>
-      <w:bookmarkStart w:id="32" w:name="_Toc226233172"/>
+      <w:bookmarkStart w:id="35" w:name="_Toc226299488"/>
       <w:r>
         <w:rPr>
           <w:rFonts w:ascii="Times New Roman" w:hAnsi="Times New Roman" w:cs="Times New Roman"/>
@@ -16016,7 +16435,7 @@
         </w:rPr>
         <w:t>10.2 Stack Tecnológico</w:t>
       </w:r>
-      <w:bookmarkEnd w:id="32"/>
+      <w:bookmarkEnd w:id="35"/>
     </w:p>
     <w:p>
       <w:pPr>
@@ -16916,7 +17335,7 @@
           <w:szCs w:val="24"/>
         </w:rPr>
       </w:pPr>
-      <w:bookmarkStart w:id="33" w:name="_Toc226233173"/>
+      <w:bookmarkStart w:id="36" w:name="_Toc226299489"/>
       <w:r>
         <w:rPr>
           <w:rFonts w:ascii="Times New Roman" w:hAnsi="Times New Roman" w:cs="Times New Roman"/>
@@ -16926,7 +17345,7 @@
         </w:rPr>
         <w:t>10.3 Diagrama de Arquitectura del Sistema</w:t>
       </w:r>
-      <w:bookmarkEnd w:id="33"/>
+      <w:bookmarkEnd w:id="36"/>
     </w:p>
     <w:p>
       <w:pPr>
@@ -17018,7 +17437,7 @@
                     </pic:cNvPicPr>
                   </pic:nvPicPr>
                   <pic:blipFill>
-                    <a:blip r:embed="rId7">
+                    <a:blip r:embed="rId11">
                       <a:extLst>
                         <a:ext uri="{28A0092B-C50C-407E-A947-70E740481C1C}">
                           <a14:useLocalDpi xmlns:a14="http://schemas.microsoft.com/office/drawing/2010/main" val="0"/>
@@ -17078,7 +17497,27 @@
           <w:sz w:val="24"/>
           <w:szCs w:val="24"/>
         </w:rPr>
-        <w:t xml:space="preserve">Figura 2. Diagrama de Arquitectura del Sistema — </w:t>
+        <w:t xml:space="preserve">Figura </w:t>
+      </w:r>
+      <w:r>
+        <w:rPr>
+          <w:rFonts w:ascii="Times New Roman" w:hAnsi="Times New Roman" w:cs="Times New Roman"/>
+          <w:i/>
+          <w:iCs/>
+          <w:sz w:val="24"/>
+          <w:szCs w:val="24"/>
+        </w:rPr>
+        <w:t>4</w:t>
+      </w:r>
+      <w:r>
+        <w:rPr>
+          <w:rFonts w:ascii="Times New Roman" w:hAnsi="Times New Roman" w:cs="Times New Roman"/>
+          <w:i/>
+          <w:iCs/>
+          <w:sz w:val="24"/>
+          <w:szCs w:val="24"/>
+        </w:rPr>
+        <w:t xml:space="preserve">. Diagrama de Arquitectura del Sistema — </w:t>
       </w:r>
       <w:proofErr w:type="spellStart"/>
       <w:r>
@@ -17113,7 +17552,7 @@
           <w:szCs w:val="24"/>
         </w:rPr>
       </w:pPr>
-      <w:bookmarkStart w:id="34" w:name="_Toc226233174"/>
+      <w:bookmarkStart w:id="37" w:name="_Toc226299490"/>
       <w:r>
         <w:rPr>
           <w:rFonts w:ascii="Times New Roman" w:hAnsi="Times New Roman" w:cs="Times New Roman"/>
@@ -17123,7 +17562,7 @@
         </w:rPr>
         <w:t>11. Modelamiento del Sistema</w:t>
       </w:r>
-      <w:bookmarkEnd w:id="34"/>
+      <w:bookmarkEnd w:id="37"/>
     </w:p>
     <w:p>
       <w:pPr>
@@ -17135,7 +17574,7 @@
           <w:szCs w:val="24"/>
         </w:rPr>
       </w:pPr>
-      <w:bookmarkStart w:id="35" w:name="_Toc226233175"/>
+      <w:bookmarkStart w:id="38" w:name="_Toc226299491"/>
       <w:r>
         <w:rPr>
           <w:rFonts w:ascii="Times New Roman" w:hAnsi="Times New Roman" w:cs="Times New Roman"/>
@@ -17145,7 +17584,7 @@
         </w:rPr>
         <w:t>11.1 Diagrama Entidad-Relación</w:t>
       </w:r>
-      <w:bookmarkEnd w:id="35"/>
+      <w:bookmarkEnd w:id="38"/>
     </w:p>
     <w:p>
       <w:pPr>
@@ -17183,7 +17622,7 @@
                     </pic:cNvPicPr>
                   </pic:nvPicPr>
                   <pic:blipFill>
-                    <a:blip r:embed="rId8">
+                    <a:blip r:embed="rId12">
                       <a:extLst>
                         <a:ext uri="{28A0092B-C50C-407E-A947-70E740481C1C}">
                           <a14:useLocalDpi xmlns:a14="http://schemas.microsoft.com/office/drawing/2010/main" val="0"/>
@@ -17233,7 +17672,27 @@
           <w:sz w:val="24"/>
           <w:szCs w:val="24"/>
         </w:rPr>
-        <w:t>Figura 3. Diagrama Entidad-Relación (Modelo Lógico PostgreSQL)</w:t>
+        <w:t xml:space="preserve">Figura </w:t>
+      </w:r>
+      <w:r>
+        <w:rPr>
+          <w:rFonts w:ascii="Times New Roman" w:hAnsi="Times New Roman" w:cs="Times New Roman"/>
+          <w:i/>
+          <w:iCs/>
+          <w:sz w:val="24"/>
+          <w:szCs w:val="24"/>
+        </w:rPr>
+        <w:t>5</w:t>
+      </w:r>
+      <w:r>
+        <w:rPr>
+          <w:rFonts w:ascii="Times New Roman" w:hAnsi="Times New Roman" w:cs="Times New Roman"/>
+          <w:i/>
+          <w:iCs/>
+          <w:sz w:val="24"/>
+          <w:szCs w:val="24"/>
+        </w:rPr>
+        <w:t>. Diagrama Entidad-Relación (Modelo Lógico PostgreSQL)</w:t>
       </w:r>
     </w:p>
     <w:p>
@@ -17256,7 +17715,7 @@
           <w:szCs w:val="24"/>
         </w:rPr>
       </w:pPr>
-      <w:bookmarkStart w:id="36" w:name="_Toc226233176"/>
+      <w:bookmarkStart w:id="39" w:name="_Toc226299492"/>
       <w:r>
         <w:rPr>
           <w:rFonts w:ascii="Times New Roman" w:hAnsi="Times New Roman" w:cs="Times New Roman"/>
@@ -17266,7 +17725,7 @@
         </w:rPr>
         <w:t>11.2 Documentación de Entidades Principales</w:t>
       </w:r>
-      <w:bookmarkEnd w:id="36"/>
+      <w:bookmarkEnd w:id="39"/>
     </w:p>
     <w:p>
       <w:pPr>
@@ -21264,7 +21723,7 @@
           <w:szCs w:val="24"/>
         </w:rPr>
       </w:pPr>
-      <w:bookmarkStart w:id="37" w:name="_Toc226233177"/>
+      <w:bookmarkStart w:id="40" w:name="_Toc226299493"/>
       <w:r>
         <w:rPr>
           <w:rFonts w:ascii="Times New Roman" w:hAnsi="Times New Roman" w:cs="Times New Roman"/>
@@ -21274,7 +21733,7 @@
         </w:rPr>
         <w:t>11.3 Diagrama de Secuencia — Registro de Emoción</w:t>
       </w:r>
-      <w:bookmarkEnd w:id="37"/>
+      <w:bookmarkEnd w:id="40"/>
     </w:p>
     <w:p>
       <w:pPr>
@@ -21312,7 +21771,7 @@
                     </pic:cNvPicPr>
                   </pic:nvPicPr>
                   <pic:blipFill>
-                    <a:blip r:embed="rId9">
+                    <a:blip r:embed="rId13">
                       <a:extLst>
                         <a:ext uri="{28A0092B-C50C-407E-A947-70E740481C1C}">
                           <a14:useLocalDpi xmlns:a14="http://schemas.microsoft.com/office/drawing/2010/main" val="0"/>
@@ -21362,7 +21821,27 @@
           <w:sz w:val="24"/>
           <w:szCs w:val="24"/>
         </w:rPr>
-        <w:t>Figura 4. Diagrama de Secuencia — Flujo de Registro Emocional</w:t>
+        <w:t xml:space="preserve">Figura </w:t>
+      </w:r>
+      <w:r>
+        <w:rPr>
+          <w:rFonts w:ascii="Times New Roman" w:hAnsi="Times New Roman" w:cs="Times New Roman"/>
+          <w:i/>
+          <w:iCs/>
+          <w:sz w:val="24"/>
+          <w:szCs w:val="24"/>
+        </w:rPr>
+        <w:t>6</w:t>
+      </w:r>
+      <w:r>
+        <w:rPr>
+          <w:rFonts w:ascii="Times New Roman" w:hAnsi="Times New Roman" w:cs="Times New Roman"/>
+          <w:i/>
+          <w:iCs/>
+          <w:sz w:val="24"/>
+          <w:szCs w:val="24"/>
+        </w:rPr>
+        <w:t>. Diagrama de Secuencia — Flujo de Registro Emocional</w:t>
       </w:r>
     </w:p>
     <w:p>
@@ -21385,7 +21864,7 @@
           <w:szCs w:val="24"/>
         </w:rPr>
       </w:pPr>
-      <w:bookmarkStart w:id="38" w:name="_Toc226233178"/>
+      <w:bookmarkStart w:id="41" w:name="_Toc226299494"/>
       <w:r>
         <w:rPr>
           <w:rFonts w:ascii="Times New Roman" w:hAnsi="Times New Roman" w:cs="Times New Roman"/>
@@ -21395,7 +21874,7 @@
         </w:rPr>
         <w:t>11.4 Diagrama de Secuencia — Generación de Alertas de Riesgo</w:t>
       </w:r>
-      <w:bookmarkEnd w:id="38"/>
+      <w:bookmarkEnd w:id="41"/>
     </w:p>
     <w:p>
       <w:pPr>
@@ -21460,7 +21939,7 @@
                     </pic:cNvPicPr>
                   </pic:nvPicPr>
                   <pic:blipFill>
-                    <a:blip r:embed="rId10">
+                    <a:blip r:embed="rId14">
                       <a:extLst>
                         <a:ext uri="{28A0092B-C50C-407E-A947-70E740481C1C}">
                           <a14:useLocalDpi xmlns:a14="http://schemas.microsoft.com/office/drawing/2010/main" val="0"/>
@@ -21510,7 +21989,27 @@
           <w:sz w:val="24"/>
           <w:szCs w:val="24"/>
         </w:rPr>
-        <w:t>Figura 5. Diagrama de Secuencia — Generación de Alertas de Riesgo</w:t>
+        <w:t xml:space="preserve">Figura </w:t>
+      </w:r>
+      <w:r>
+        <w:rPr>
+          <w:rFonts w:ascii="Times New Roman" w:hAnsi="Times New Roman" w:cs="Times New Roman"/>
+          <w:i/>
+          <w:iCs/>
+          <w:sz w:val="24"/>
+          <w:szCs w:val="24"/>
+        </w:rPr>
+        <w:t>7</w:t>
+      </w:r>
+      <w:r>
+        <w:rPr>
+          <w:rFonts w:ascii="Times New Roman" w:hAnsi="Times New Roman" w:cs="Times New Roman"/>
+          <w:i/>
+          <w:iCs/>
+          <w:sz w:val="24"/>
+          <w:szCs w:val="24"/>
+        </w:rPr>
+        <w:t>. Diagrama de Secuencia — Generación de Alertas de Riesgo</w:t>
       </w:r>
     </w:p>
     <w:p>
@@ -21533,7 +22032,7 @@
           <w:szCs w:val="24"/>
         </w:rPr>
       </w:pPr>
-      <w:bookmarkStart w:id="39" w:name="_Toc226233179"/>
+      <w:bookmarkStart w:id="42" w:name="_Toc226299495"/>
       <w:r>
         <w:rPr>
           <w:rFonts w:ascii="Times New Roman" w:hAnsi="Times New Roman" w:cs="Times New Roman"/>
@@ -21543,7 +22042,7 @@
         </w:rPr>
         <w:t>12. Conclusiones</w:t>
       </w:r>
-      <w:bookmarkEnd w:id="39"/>
+      <w:bookmarkEnd w:id="42"/>
     </w:p>
     <w:p>
       <w:pPr>
@@ -21717,7 +22216,7 @@
           <w:szCs w:val="24"/>
         </w:rPr>
       </w:pPr>
-      <w:bookmarkStart w:id="40" w:name="_Toc226233180"/>
+      <w:bookmarkStart w:id="43" w:name="_Toc226299496"/>
       <w:r>
         <w:rPr>
           <w:rFonts w:ascii="Times New Roman" w:hAnsi="Times New Roman" w:cs="Times New Roman"/>
@@ -21728,7 +22227,7 @@
         <w:lastRenderedPageBreak/>
         <w:t>Referencias Bibliográficas</w:t>
       </w:r>
-      <w:bookmarkEnd w:id="40"/>
+      <w:bookmarkEnd w:id="43"/>
     </w:p>
     <w:p>
       <w:pPr>
@@ -21938,6 +22437,44 @@
     </w:sectPr>
   </w:body>
 </w:document>
+</file>
+
+<file path=word/endnotes.xml><?xml version="1.0" encoding="utf-8"?>
+<w:endnotes xmlns:wpc="http://schemas.microsoft.com/office/word/2010/wordprocessingCanvas" xmlns:cx="http://schemas.microsoft.com/office/drawing/2014/chartex" xmlns:cx1="http://schemas.microsoft.com/office/drawing/2015/9/8/chartex" xmlns:cx2="http://schemas.microsoft.com/office/drawing/2015/10/21/chartex" xmlns:cx3="http://schemas.microsoft.com/office/drawing/2016/5/9/chartex" xmlns:cx4="http://schemas.microsoft.com/office/drawing/2016/5/10/chartex" xmlns:cx5="http://schemas.microsoft.com/office/drawing/2016/5/11/chartex" xmlns:cx6="http://schemas.microsoft.com/office/drawing/2016/5/12/chartex" xmlns:cx7="http://schemas.microsoft.com/office/drawing/2016/5/13/chartex" xmlns:cx8="http://schemas.microsoft.com/office/drawing/2016/5/14/chartex" xmlns:mc="http://schemas.openxmlformats.org/markup-compatibility/2006" xmlns:aink="http://schemas.microsoft.com/office/drawing/2016/ink" xmlns:am3d="http://schemas.microsoft.com/office/drawing/2017/model3d" xmlns:o="urn:schemas-microsoft-com:office:office" xmlns:oel="http://schemas.microsoft.com/office/2019/extlst" xmlns:r="http://schemas.openxmlformats.org/officeDocument/2006/relationships" xmlns:m="http://schemas.openxmlformats.org/officeDocument/2006/math" xmlns:v="urn:schemas-microsoft-com:vml" xmlns:wp14="http://schemas.microsoft.com/office/word/2010/wordprocessingDrawing" xmlns:wp="http://schemas.openxmlformats.org/drawingml/2006/wordprocessingDrawing" xmlns:w10="urn:schemas-microsoft-com:office:word" xmlns:w="http://schemas.openxmlformats.org/wordprocessingml/2006/main" xmlns:w14="http://schemas.microsoft.com/office/word/2010/wordml" xmlns:w15="http://schemas.microsoft.com/office/word/2012/wordml" xmlns:w16cex="http://schemas.microsoft.com/office/word/2018/wordml/cex" xmlns:w16cid="http://schemas.microsoft.com/office/word/2016/wordml/cid" xmlns:w16="http://schemas.microsoft.com/office/word/2018/wordml" xmlns:w16du="http://schemas.microsoft.com/office/word/2023/wordml/word16du" xmlns:w16sdtdh="http://schemas.microsoft.com/office/word/2020/wordml/sdtdatahash" xmlns:w16sdtfl="http://schemas.microsoft.com/office/word/2024/wordml/sdtformatlock" xmlns:w16se="http://schemas.microsoft.com/office/word/2015/wordml/symex" xmlns:wpg="http://schemas.microsoft.com/office/word/2010/wordprocessingGroup" xmlns:wpi="http://schemas.microsoft.com/office/word/2010/wordprocessingInk" xmlns:wne="http://schemas.microsoft.com/office/word/2006/wordml" xmlns:wps="http://schemas.microsoft.com/office/word/2010/wordprocessingShape" mc:Ignorable="w14 w15 w16se w16cid w16 w16cex w16sdtdh w16sdtfl w16du wp14">
+  <w:endnote w:type="separator" w:id="-1">
+    <w:p>
+      <w:r>
+        <w:separator/>
+      </w:r>
+    </w:p>
+  </w:endnote>
+  <w:endnote w:type="continuationSeparator" w:id="0">
+    <w:p>
+      <w:r>
+        <w:continuationSeparator/>
+      </w:r>
+    </w:p>
+  </w:endnote>
+</w:endnotes>
+</file>
+
+<file path=word/footnotes.xml><?xml version="1.0" encoding="utf-8"?>
+<w:footnotes xmlns:wpc="http://schemas.microsoft.com/office/word/2010/wordprocessingCanvas" xmlns:cx="http://schemas.microsoft.com/office/drawing/2014/chartex" xmlns:cx1="http://schemas.microsoft.com/office/drawing/2015/9/8/chartex" xmlns:cx2="http://schemas.microsoft.com/office/drawing/2015/10/21/chartex" xmlns:cx3="http://schemas.microsoft.com/office/drawing/2016/5/9/chartex" xmlns:cx4="http://schemas.microsoft.com/office/drawing/2016/5/10/chartex" xmlns:cx5="http://schemas.microsoft.com/office/drawing/2016/5/11/chartex" xmlns:cx6="http://schemas.microsoft.com/office/drawing/2016/5/12/chartex" xmlns:cx7="http://schemas.microsoft.com/office/drawing/2016/5/13/chartex" xmlns:cx8="http://schemas.microsoft.com/office/drawing/2016/5/14/chartex" xmlns:mc="http://schemas.openxmlformats.org/markup-compatibility/2006" xmlns:aink="http://schemas.microsoft.com/office/drawing/2016/ink" xmlns:am3d="http://schemas.microsoft.com/office/drawing/2017/model3d" xmlns:o="urn:schemas-microsoft-com:office:office" xmlns:oel="http://schemas.microsoft.com/office/2019/extlst" xmlns:r="http://schemas.openxmlformats.org/officeDocument/2006/relationships" xmlns:m="http://schemas.openxmlformats.org/officeDocument/2006/math" xmlns:v="urn:schemas-microsoft-com:vml" xmlns:wp14="http://schemas.microsoft.com/office/word/2010/wordprocessingDrawing" xmlns:wp="http://schemas.openxmlformats.org/drawingml/2006/wordprocessingDrawing" xmlns:w10="urn:schemas-microsoft-com:office:word" xmlns:w="http://schemas.openxmlformats.org/wordprocessingml/2006/main" xmlns:w14="http://schemas.microsoft.com/office/word/2010/wordml" xmlns:w15="http://schemas.microsoft.com/office/word/2012/wordml" xmlns:w16cex="http://schemas.microsoft.com/office/word/2018/wordml/cex" xmlns:w16cid="http://schemas.microsoft.com/office/word/2016/wordml/cid" xmlns:w16="http://schemas.microsoft.com/office/word/2018/wordml" xmlns:w16du="http://schemas.microsoft.com/office/word/2023/wordml/word16du" xmlns:w16sdtdh="http://schemas.microsoft.com/office/word/2020/wordml/sdtdatahash" xmlns:w16sdtfl="http://schemas.microsoft.com/office/word/2024/wordml/sdtformatlock" xmlns:w16se="http://schemas.microsoft.com/office/word/2015/wordml/symex" xmlns:wpg="http://schemas.microsoft.com/office/word/2010/wordprocessingGroup" xmlns:wpi="http://schemas.microsoft.com/office/word/2010/wordprocessingInk" xmlns:wne="http://schemas.microsoft.com/office/word/2006/wordml" xmlns:wps="http://schemas.microsoft.com/office/word/2010/wordprocessingShape" mc:Ignorable="w14 w15 w16se w16cid w16 w16cex w16sdtdh w16sdtfl w16du wp14">
+  <w:footnote w:type="separator" w:id="-1">
+    <w:p>
+      <w:r>
+        <w:separator/>
+      </w:r>
+    </w:p>
+  </w:footnote>
+  <w:footnote w:type="continuationSeparator" w:id="0">
+    <w:p>
+      <w:r>
+        <w:continuationSeparator/>
+      </w:r>
+    </w:p>
+  </w:footnote>
+</w:footnotes>
 </file>
 
 <file path=word/numbering.xml><?xml version="1.0" encoding="utf-8"?>
@@ -22136,6 +22673,121 @@
       <w:lvlJc w:val="left"/>
     </w:lvl>
   </w:abstractNum>
+  <w:abstractNum w:abstractNumId="3" w15:restartNumberingAfterBreak="0">
+    <w:nsid w:val="78291B6C"/>
+    <w:multiLevelType w:val="hybridMultilevel"/>
+    <w:tmpl w:val="5AD2C026"/>
+    <w:lvl w:ilvl="0" w:tplc="27541BD0">
+      <w:start w:val="4"/>
+      <w:numFmt w:val="bullet"/>
+      <w:lvlText w:val=""/>
+      <w:lvlJc w:val="left"/>
+      <w:pPr>
+        <w:ind w:left="720" w:hanging="360"/>
+      </w:pPr>
+      <w:rPr>
+        <w:rFonts w:ascii="Symbol" w:eastAsia="Times New Roman" w:hAnsi="Symbol" w:cs="Times New Roman" w:hint="default"/>
+        <w:b w:val="0"/>
+        <w:bCs/>
+      </w:rPr>
+    </w:lvl>
+    <w:lvl w:ilvl="1" w:tplc="0C0A0003" w:tentative="1">
+      <w:start w:val="1"/>
+      <w:numFmt w:val="bullet"/>
+      <w:lvlText w:val="o"/>
+      <w:lvlJc w:val="left"/>
+      <w:pPr>
+        <w:ind w:left="1440" w:hanging="360"/>
+      </w:pPr>
+      <w:rPr>
+        <w:rFonts w:ascii="Courier New" w:hAnsi="Courier New" w:cs="Courier New" w:hint="default"/>
+      </w:rPr>
+    </w:lvl>
+    <w:lvl w:ilvl="2" w:tplc="0C0A0005" w:tentative="1">
+      <w:start w:val="1"/>
+      <w:numFmt w:val="bullet"/>
+      <w:lvlText w:val=""/>
+      <w:lvlJc w:val="left"/>
+      <w:pPr>
+        <w:ind w:left="2160" w:hanging="360"/>
+      </w:pPr>
+      <w:rPr>
+        <w:rFonts w:ascii="Wingdings" w:hAnsi="Wingdings" w:hint="default"/>
+      </w:rPr>
+    </w:lvl>
+    <w:lvl w:ilvl="3" w:tplc="0C0A0001" w:tentative="1">
+      <w:start w:val="1"/>
+      <w:numFmt w:val="bullet"/>
+      <w:lvlText w:val=""/>
+      <w:lvlJc w:val="left"/>
+      <w:pPr>
+        <w:ind w:left="2880" w:hanging="360"/>
+      </w:pPr>
+      <w:rPr>
+        <w:rFonts w:ascii="Symbol" w:hAnsi="Symbol" w:hint="default"/>
+      </w:rPr>
+    </w:lvl>
+    <w:lvl w:ilvl="4" w:tplc="0C0A0003" w:tentative="1">
+      <w:start w:val="1"/>
+      <w:numFmt w:val="bullet"/>
+      <w:lvlText w:val="o"/>
+      <w:lvlJc w:val="left"/>
+      <w:pPr>
+        <w:ind w:left="3600" w:hanging="360"/>
+      </w:pPr>
+      <w:rPr>
+        <w:rFonts w:ascii="Courier New" w:hAnsi="Courier New" w:cs="Courier New" w:hint="default"/>
+      </w:rPr>
+    </w:lvl>
+    <w:lvl w:ilvl="5" w:tplc="0C0A0005" w:tentative="1">
+      <w:start w:val="1"/>
+      <w:numFmt w:val="bullet"/>
+      <w:lvlText w:val=""/>
+      <w:lvlJc w:val="left"/>
+      <w:pPr>
+        <w:ind w:left="4320" w:hanging="360"/>
+      </w:pPr>
+      <w:rPr>
+        <w:rFonts w:ascii="Wingdings" w:hAnsi="Wingdings" w:hint="default"/>
+      </w:rPr>
+    </w:lvl>
+    <w:lvl w:ilvl="6" w:tplc="0C0A0001" w:tentative="1">
+      <w:start w:val="1"/>
+      <w:numFmt w:val="bullet"/>
+      <w:lvlText w:val=""/>
+      <w:lvlJc w:val="left"/>
+      <w:pPr>
+        <w:ind w:left="5040" w:hanging="360"/>
+      </w:pPr>
+      <w:rPr>
+        <w:rFonts w:ascii="Symbol" w:hAnsi="Symbol" w:hint="default"/>
+      </w:rPr>
+    </w:lvl>
+    <w:lvl w:ilvl="7" w:tplc="0C0A0003" w:tentative="1">
+      <w:start w:val="1"/>
+      <w:numFmt w:val="bullet"/>
+      <w:lvlText w:val="o"/>
+      <w:lvlJc w:val="left"/>
+      <w:pPr>
+        <w:ind w:left="5760" w:hanging="360"/>
+      </w:pPr>
+      <w:rPr>
+        <w:rFonts w:ascii="Courier New" w:hAnsi="Courier New" w:cs="Courier New" w:hint="default"/>
+      </w:rPr>
+    </w:lvl>
+    <w:lvl w:ilvl="8" w:tplc="0C0A0005" w:tentative="1">
+      <w:start w:val="1"/>
+      <w:numFmt w:val="bullet"/>
+      <w:lvlText w:val=""/>
+      <w:lvlJc w:val="left"/>
+      <w:pPr>
+        <w:ind w:left="6480" w:hanging="360"/>
+      </w:pPr>
+      <w:rPr>
+        <w:rFonts w:ascii="Wingdings" w:hAnsi="Wingdings" w:hint="default"/>
+      </w:rPr>
+    </w:lvl>
+  </w:abstractNum>
   <w:num w:numId="1" w16cid:durableId="2140679785">
     <w:abstractNumId w:val="1"/>
     <w:lvlOverride w:ilvl="0">
@@ -22153,6 +22805,9 @@
     <w:lvlOverride w:ilvl="0">
       <w:startOverride w:val="1"/>
     </w:lvlOverride>
+  </w:num>
+  <w:num w:numId="4" w16cid:durableId="1959793865">
+    <w:abstractNumId w:val="3"/>
   </w:num>
 </w:numbering>
 </file>
@@ -22829,6 +23484,60 @@
       <w:bCs/>
     </w:rPr>
   </w:style>
+  <w:style w:type="character" w:styleId="Mencinsinresolver">
+    <w:name w:val="Unresolved Mention"/>
+    <w:basedOn w:val="Fuentedeprrafopredeter"/>
+    <w:uiPriority w:val="99"/>
+    <w:semiHidden/>
+    <w:unhideWhenUsed/>
+    <w:rsid w:val="003C28EB"/>
+    <w:rPr>
+      <w:color w:val="605E5C"/>
+      <w:shd w:val="clear" w:color="auto" w:fill="E1DFDD"/>
+    </w:rPr>
+  </w:style>
+  <w:style w:type="paragraph" w:styleId="Encabezado">
+    <w:name w:val="header"/>
+    <w:basedOn w:val="Normal"/>
+    <w:link w:val="EncabezadoCar"/>
+    <w:uiPriority w:val="99"/>
+    <w:unhideWhenUsed/>
+    <w:rsid w:val="003C28EB"/>
+    <w:pPr>
+      <w:tabs>
+        <w:tab w:val="center" w:pos="4252"/>
+        <w:tab w:val="right" w:pos="8504"/>
+      </w:tabs>
+    </w:pPr>
+  </w:style>
+  <w:style w:type="character" w:customStyle="1" w:styleId="EncabezadoCar">
+    <w:name w:val="Encabezado Car"/>
+    <w:basedOn w:val="Fuentedeprrafopredeter"/>
+    <w:link w:val="Encabezado"/>
+    <w:uiPriority w:val="99"/>
+    <w:rsid w:val="003C28EB"/>
+  </w:style>
+  <w:style w:type="paragraph" w:styleId="Piedepgina">
+    <w:name w:val="footer"/>
+    <w:basedOn w:val="Normal"/>
+    <w:link w:val="PiedepginaCar"/>
+    <w:uiPriority w:val="99"/>
+    <w:unhideWhenUsed/>
+    <w:rsid w:val="003C28EB"/>
+    <w:pPr>
+      <w:tabs>
+        <w:tab w:val="center" w:pos="4252"/>
+        <w:tab w:val="right" w:pos="8504"/>
+      </w:tabs>
+    </w:pPr>
+  </w:style>
+  <w:style w:type="character" w:customStyle="1" w:styleId="PiedepginaCar">
+    <w:name w:val="Pie de página Car"/>
+    <w:basedOn w:val="Fuentedeprrafopredeter"/>
+    <w:link w:val="Piedepgina"/>
+    <w:uiPriority w:val="99"/>
+    <w:rsid w:val="003C28EB"/>
+  </w:style>
 </w:styles>
 </file>
 

</xml_diff>